<commit_message>
paper: integrate v3.13 figures and clarify cohort attention
</commit_message>
<xml_diff>
--- a/paper/DCT_v313_初稿.docx
+++ b/paper/DCT_v313_初稿.docx
@@ -60,7 +60,7 @@
           <w:color w:val="000000"/>
           <w:sz w:val="21"/>
         </w:rPr>
-        <w:t>现有 UNI2-h 五折最佳验证记录覆盖十个 TCGA 癌症队列，完整模型的队列平均 C-index 为 0.7030。在 BLCA 和 KIRC 的同架构损失消融中，完整联合目标分别达到 0.7238 和 0.8224，相对仅患者级 NLL 提高 2.37 和 1.04 个 C-index 百分点。重跑并审计的机制对照显示，Full 相对 Direct 分别提高 2.09 和 1.94 个百分点，相对 Independent 分别提高 1.45 和 1.70 个百分点。这些结果支持当前完整训练配方与运输计算路径的任务价值。本文采用单随机种子、按验证集选择最佳 epoch 的评价口径；平均提升不表述为统计显著、独立测试泛化或生物学因果证据。</w:t>
+        <w:t>现有 UNI2-h 五折最佳验证记录覆盖十个 TCGA 癌症队列，完整模型的队列平均 C-index 为 0.7030。在 BLCA 和 KIRC 的同架构损失消融中，完整联合目标分别达到 0.7238 和 0.8224，相对仅患者级 NLL 提高 2.37 和 1.04 个 C-index 百分点。重跑并审计的机制对照显示，Full 相对 Direct 分别提高 2.09 和 1.93 个百分点，相对 Independent 分别提高 1.46 和 1.70 个百分点。这些结果支持当前完整训练配方与运输计算路径的任务价值。本文采用单随机种子、按验证集选择最佳 epoch 的评价口径；平均提升不表述为统计显著、独立测试泛化或生物学因果证据。</w:t>
       </w:r>
     </w:p>
     <w:p>
@@ -709,21 +709,43 @@
     <w:p>
       <w:pPr>
         <w:keepNext/>
-        <w:spacing w:before="240" w:after="1280"/>
         <w:ind w:firstLine="0"/>
         <w:jc w:val="center"/>
       </w:pPr>
-      <w:bookmarkStart w:id="101" w:name="figure_pending_1"/>
       <w:r>
-        <w:rPr>
-          <w:rFonts w:ascii="Times New Roman" w:hAnsi="Times New Roman" w:eastAsia="宋体"/>
-          <w:b w:val="0"/>
-          <w:color w:val="000000"/>
-          <w:sz w:val="18"/>
-        </w:rPr>
-        <w:t>图 1 待插入</w:t>
+        <w:drawing>
+          <wp:inline xmlns:a="http://schemas.openxmlformats.org/drawingml/2006/main" xmlns:pic="http://schemas.openxmlformats.org/drawingml/2006/picture">
+            <wp:extent cx="5940000" cy="3948750"/>
+            <wp:docPr id="1" name="Picture 1" descr="DCT v3.13 框架图，M1-M4 标出相对 SlotSPE 的结构改动"/>
+            <wp:cNvGraphicFramePr>
+              <a:graphicFrameLocks noChangeAspect="1"/>
+            </wp:cNvGraphicFramePr>
+            <a:graphic>
+              <a:graphicData uri="http://schemas.openxmlformats.org/drawingml/2006/picture">
+                <pic:pic>
+                  <pic:nvPicPr>
+                    <pic:cNvPr id="0" name="fig1_v313_framework_en.png"/>
+                    <pic:cNvPicPr/>
+                  </pic:nvPicPr>
+                  <pic:blipFill>
+                    <a:blip r:embed="rId10"/>
+                    <a:stretch>
+                      <a:fillRect/>
+                    </a:stretch>
+                  </pic:blipFill>
+                  <pic:spPr>
+                    <a:xfrm>
+                      <a:off x="0" y="0"/>
+                      <a:ext cx="5940000" cy="3948750"/>
+                    </a:xfrm>
+                    <a:prstGeom prst="rect"/>
+                  </pic:spPr>
+                </pic:pic>
+              </a:graphicData>
+            </a:graphic>
+          </wp:inline>
+        </w:drawing>
       </w:r>
-      <w:bookmarkEnd w:id="101"/>
     </w:p>
     <w:p>
       <w:pPr>
@@ -738,7 +760,7 @@
           <w:color w:val="000000"/>
           <w:sz w:val="18"/>
         </w:rPr>
-        <w:t>图 1 DCT v3.13 完整框架。（A）病理块与组学通路分别编码，通过局部槽注意力和模态内原型坐标形成语义槽。（B）四个潜在阶段、三个几何分支分别学习带证据边际的运输计划。（C）运输质量和槽对内容形成事件表示，经事件 Transformer、阶段门与风险头得到患者生存预测。（D）训练时复用同一预测运输计划：仅在重建支路中对几何分支取均值，将病理槽映射到组学槽坐标，并以停止梯度的阶段权重融合；组学槽直接执行 self 重建，两支路共用通路查询解码器。橙色 SG 表示停止梯度，运输计划保持可微；实线表示预测路径，虚线表示训练支路。图中的张量色块、病理纹理和生存曲线均为示意。</w:t>
+        <w:t>图 1 DCT v3.13 完整框架。沿用病理与组学双路编码和局部 Slot Attention；彩色模块标出相对 SlotSPE 的实际改动。（M1）局部槽经模态内原型坐标重分配，原型库在患者间复用。（M2）四个学习的潜在阶段、三个几何分支形成带证据边际的 Sinkhorn 运输计划。（M3）运输计划与槽对内容共同构建事件 tokens，经阶段嵌入、事件 Transformer、并行的阶段门控与事件 logits 头得到加权生存预测。（M4）训练时复用预测所用的同一组运输计划：仅在重建支路中对几何取均值，将病理槽按列归一化搬运至组学槽坐标，再以停止梯度的预测门控聚合；组学槽执行 self 重建，两支路共用通路查询解码器，目标为停止梯度的编码通路 tokens。预测主路径由左向右排列，重建采用两条水平支路；同名 S、T、g 圆形标记表示复用同一对语义槽、同一组预测运输计划与同一预测门控。实线表示预测路径，虚线表示训练支路；SG 表示停止梯度，运输计划保持可微。阶段不等同于已标注的疾病分期，图中张量与病理纹理均为结构示意。</w:t>
       </w:r>
     </w:p>
     <w:p>
@@ -5823,7 +5845,7 @@
           <w:color w:val="000000"/>
           <w:sz w:val="21"/>
         </w:rPr>
-        <w:t>对每个癌种，本文报告五折均值与样本标准差。标准差描述折间波动，不是均值置信区间或多 seed 方差。十队列汇总对癌种均值等权平均；每队列均为五折时，该值也等于 50 个折值的平均。均值差按表中四位小数计算，并转换为 C-index 百分点；不混合两个癌种计算一个所谓总体机制效应。</w:t>
+        <w:t>对每个癌种，本文报告五折均值与样本标准差。标准差描述折间波动，不是均值置信区间或多 seed 方差。十队列汇总对癌种均值等权平均；每队列均为五折时，该值也等于 50 个折值的平均。损失消融按四位折值、机制对照按原始精度计算均值差，报告 C-index 百分点；分别分析两个癌种。</w:t>
       </w:r>
     </w:p>
     <w:p>
@@ -11999,21 +12021,43 @@
     <w:p>
       <w:pPr>
         <w:keepNext/>
-        <w:spacing w:before="240" w:after="1280"/>
         <w:ind w:firstLine="0"/>
         <w:jc w:val="center"/>
       </w:pPr>
-      <w:bookmarkStart w:id="102" w:name="figure_pending_2"/>
       <w:r>
-        <w:rPr>
-          <w:rFonts w:ascii="Times New Roman" w:hAnsi="Times New Roman" w:eastAsia="宋体"/>
-          <w:b w:val="0"/>
-          <w:color w:val="000000"/>
-          <w:sz w:val="18"/>
-        </w:rPr>
-        <w:t>图 2 待插入</w:t>
+        <w:drawing>
+          <wp:inline xmlns:a="http://schemas.openxmlformats.org/drawingml/2006/main" xmlns:pic="http://schemas.openxmlformats.org/drawingml/2006/picture">
+            <wp:extent cx="5940000" cy="3355000"/>
+            <wp:docPr id="2" name="Picture 2" descr="七组损失配置的逐折分布、五折均值与样本标准差"/>
+            <wp:cNvGraphicFramePr>
+              <a:graphicFrameLocks noChangeAspect="1"/>
+            </wp:cNvGraphicFramePr>
+            <a:graphic>
+              <a:graphicData uri="http://schemas.openxmlformats.org/drawingml/2006/picture">
+                <pic:pic>
+                  <pic:nvPicPr>
+                    <pic:cNvPr id="0" name="fig2_loss_ablation.png"/>
+                    <pic:cNvPicPr/>
+                  </pic:nvPicPr>
+                  <pic:blipFill>
+                    <a:blip r:embed="rId11"/>
+                    <a:stretch>
+                      <a:fillRect/>
+                    </a:stretch>
+                  </pic:blipFill>
+                  <pic:spPr>
+                    <a:xfrm>
+                      <a:off x="0" y="0"/>
+                      <a:ext cx="5940000" cy="3355000"/>
+                    </a:xfrm>
+                    <a:prstGeom prst="rect"/>
+                  </pic:spPr>
+                </pic:pic>
+              </a:graphicData>
+            </a:graphic>
+          </wp:inline>
+        </w:drawing>
       </w:r>
-      <w:bookmarkEnd w:id="102"/>
     </w:p>
     <w:p>
       <w:pPr>
@@ -12814,7 +12858,7 @@
           <w:color w:val="000000"/>
           <w:sz w:val="21"/>
         </w:rPr>
-        <w:t>Direct 的主预测仍使用学习 OT，只把 cross 解码器的输入改为未运输的病理槽。因此 Full 与 Direct 比较检验“辅助重建是否从预测所用的运输对齐中受益”，不是有无 cross 重建。BLCA 的 Full 为 0.7238，Direct 为 0.7029，提高 0.0209，即 2.09 个百分点；KIRC 从 0.8030 到 0.8224，提高 1.94 个百分点。当前两队列的平均结果均支持保留运输对齐的重建输入。</w:t>
+        <w:t>Direct 的主预测仍使用学习 OT，只把 cross 解码器的输入改为未运输的病理槽。因此 Full 与 Direct 比较检验“辅助重建是否从预测所用的运输对齐中受益”，不是有无 cross 重建。BLCA 的 Full 为 0.7238，Direct 为 0.7029，提高 0.0209，即 2.09 个百分点；KIRC 从 0.8030 到 0.8224，提高 1.93 个百分点。当前两队列的平均结果均支持保留运输对齐的重建输入。</w:t>
       </w:r>
     </w:p>
     <w:p>
@@ -12828,7 +12872,7 @@
           <w:color w:val="000000"/>
           <w:sz w:val="21"/>
         </w:rPr>
-        <w:t>Independent 保留两侧槽与学习边际，将非独立的联合运输计划替换为边际乘积，并同时用于风险预测和 cross 重建。Full 相对 Independent 在 BLCA 提高 1.45 个百分点，在 KIRC 提高 1.70 个百分点。这一对照支持学习联合匹配的任务价值；由于它改变预测与重建两个位置，不能把差值单独归因于某一个位置。</w:t>
+        <w:t>Independent 保留两侧槽与学习边际，将非独立的联合运输计划替换为边际乘积，并同时用于风险预测和 cross 重建。Full 相对 Independent 在 BLCA 提高 1.46 个百分点，在 KIRC 提高 1.70 个百分点。这一对照支持学习联合匹配的任务价值；由于它改变预测与重建两个位置，不能把差值单独归因于某一个位置。</w:t>
       </w:r>
     </w:p>
     <w:p>
@@ -12848,21 +12892,43 @@
     <w:p>
       <w:pPr>
         <w:keepNext/>
-        <w:spacing w:before="240" w:after="1280"/>
         <w:ind w:firstLine="0"/>
         <w:jc w:val="center"/>
       </w:pPr>
-      <w:bookmarkStart w:id="103" w:name="figure_pending_3"/>
       <w:r>
-        <w:rPr>
-          <w:rFonts w:ascii="Times New Roman" w:hAnsi="Times New Roman" w:eastAsia="宋体"/>
-          <w:b w:val="0"/>
-          <w:color w:val="000000"/>
-          <w:sz w:val="18"/>
-        </w:rPr>
-        <w:t>图 3 待插入</w:t>
+        <w:drawing>
+          <wp:inline xmlns:a="http://schemas.openxmlformats.org/drawingml/2006/main" xmlns:pic="http://schemas.openxmlformats.org/drawingml/2006/picture">
+            <wp:extent cx="5940000" cy="5170000"/>
+            <wp:docPr id="3" name="Picture 3" descr="Full 与重训控制臂的逐折 C-index 及差值"/>
+            <wp:cNvGraphicFramePr>
+              <a:graphicFrameLocks noChangeAspect="1"/>
+            </wp:cNvGraphicFramePr>
+            <a:graphic>
+              <a:graphicData uri="http://schemas.openxmlformats.org/drawingml/2006/picture">
+                <pic:pic>
+                  <pic:nvPicPr>
+                    <pic:cNvPr id="0" name="fig3_trained_controls.png"/>
+                    <pic:cNvPicPr/>
+                  </pic:nvPicPr>
+                  <pic:blipFill>
+                    <a:blip r:embed="rId12"/>
+                    <a:stretch>
+                      <a:fillRect/>
+                    </a:stretch>
+                  </pic:blipFill>
+                  <pic:spPr>
+                    <a:xfrm>
+                      <a:off x="0" y="0"/>
+                      <a:ext cx="5940000" cy="5170000"/>
+                    </a:xfrm>
+                    <a:prstGeom prst="rect"/>
+                  </pic:spPr>
+                </pic:pic>
+              </a:graphicData>
+            </a:graphic>
+          </wp:inline>
+        </w:drawing>
       </w:r>
-      <w:bookmarkEnd w:id="103"/>
     </w:p>
     <w:p>
       <w:pPr>
@@ -12877,7 +12943,7 @@
           <w:color w:val="000000"/>
           <w:sz w:val="18"/>
         </w:rPr>
-        <w:t>图 3 Full 相对训练对照的逐折变化。BLCA 与 KIRC 分开显示 Full、Direct、Independent，按相同 fold 连线；同时报告五折平均绝对差。Full 折值来自损失消融记录，控制臂来自重跑审计记录，最终合图需核对同折患者、结局、配置和评分口径。图不预设每一折都提高，不添加未经有效检验支持的显著性星号。</w:t>
+        <w:t>图 3 Full 相对训练对照的逐折变化。BLCA 与 KIRC 分开显示 Full、Direct、Independent，按相同 fold 连线；同时报告五折均值差（Full−control）。Full 使用图 4 源 JSON 中的事实逐折成绩，与损失消融的四位记录一致；控制臂来自重跑审计记录。均值差按未四舍五入的逐折成绩计算，最终公平比较仍需完成 Full 与控制臂的患者、结局和配置配对核对。图不预设每一折都提高，不添加未经有效检验支持的显著性星号。</w:t>
       </w:r>
     </w:p>
     <w:p>
@@ -14064,7 +14130,7 @@
         <w:drawing>
           <wp:inline xmlns:a="http://schemas.openxmlformats.org/drawingml/2006/main" xmlns:pic="http://schemas.openxmlformats.org/drawingml/2006/picture">
             <wp:extent cx="5940000" cy="2443434"/>
-            <wp:docPr id="1" name="Picture 1" descr="固定 Full 模型的运输计划替换，BLCA 和 KIRC 各五折"/>
+            <wp:docPr id="4" name="Picture 4" descr="固定 Full 模型的运输计划替换，BLCA 和 KIRC 各五折"/>
             <wp:cNvGraphicFramePr>
               <a:graphicFrameLocks noChangeAspect="1"/>
             </wp:cNvGraphicFramePr>
@@ -14076,7 +14142,7 @@
                     <pic:cNvPicPr/>
                   </pic:nvPicPr>
                   <pic:blipFill>
-                    <a:blip r:embed="rId10"/>
+                    <a:blip r:embed="rId13"/>
                     <a:stretch>
                       <a:fillRect/>
                     </a:stretch>
@@ -14185,21 +14251,43 @@
     <w:p>
       <w:pPr>
         <w:keepNext/>
-        <w:spacing w:before="240" w:after="1280"/>
         <w:ind w:firstLine="0"/>
         <w:jc w:val="center"/>
       </w:pPr>
-      <w:bookmarkStart w:id="105" w:name="figure_pending_5"/>
       <w:r>
-        <w:rPr>
-          <w:rFonts w:ascii="Times New Roman" w:hAnsi="Times New Roman" w:eastAsia="宋体"/>
-          <w:b w:val="0"/>
-          <w:color w:val="000000"/>
-          <w:sz w:val="18"/>
-        </w:rPr>
-        <w:t>图 5 待插入</w:t>
+        <w:drawing>
+          <wp:inline xmlns:a="http://schemas.openxmlformats.org/drawingml/2006/main" xmlns:pic="http://schemas.openxmlformats.org/drawingml/2006/picture">
+            <wp:extent cx="5940000" cy="5841000"/>
+            <wp:docPr id="5" name="Picture 5" descr="BLCA Full 五折总体高低风险生存曲线"/>
+            <wp:cNvGraphicFramePr>
+              <a:graphicFrameLocks noChangeAspect="1"/>
+            </wp:cNvGraphicFramePr>
+            <a:graphic>
+              <a:graphicData uri="http://schemas.openxmlformats.org/drawingml/2006/picture">
+                <pic:pic>
+                  <pic:nvPicPr>
+                    <pic:cNvPr id="0" name="km_blca_exp6_oof.png"/>
+                    <pic:cNvPicPr/>
+                  </pic:nvPicPr>
+                  <pic:blipFill>
+                    <a:blip r:embed="rId14"/>
+                    <a:stretch>
+                      <a:fillRect/>
+                    </a:stretch>
+                  </pic:blipFill>
+                  <pic:spPr>
+                    <a:xfrm>
+                      <a:off x="0" y="0"/>
+                      <a:ext cx="5940000" cy="5841000"/>
+                    </a:xfrm>
+                    <a:prstGeom prst="rect"/>
+                  </pic:spPr>
+                </pic:pic>
+              </a:graphicData>
+            </a:graphic>
+          </wp:inline>
+        </w:drawing>
       </w:r>
-      <w:bookmarkEnd w:id="105"/>
     </w:p>
     <w:p>
       <w:pPr>
@@ -14214,7 +14302,64 @@
           <w:color w:val="000000"/>
           <w:sz w:val="18"/>
         </w:rPr>
-        <w:t>图 5 各癌种总体高低风险 KM 曲线。每个癌种一个面板，蓝色为低风险、红色为高风险；分组依据各患者对应折模型的训练风险中位数，汇总五折组别后计算生存曲线。展示删失标记、名义 95% 置信区间和在险人数。曲线检查开发阶段的风险分层，不替代独立测试或临床效用评价。</w:t>
+        <w:t>图 5a BLCA 总体高低风险 KM 曲线。共 380 名验证患者，低风险 172 人、高风险 208 人；蓝色为低风险、红色为高风险。每折按训练患者风险中位数固定分组阈值，再汇总验证患者组别与结局；展示删失标记、名义 95% 置信区间和在险人数。</w:t>
+      </w:r>
+    </w:p>
+    <w:p>
+      <w:pPr>
+        <w:keepNext/>
+        <w:ind w:firstLine="0"/>
+        <w:jc w:val="center"/>
+      </w:pPr>
+      <w:r>
+        <w:drawing>
+          <wp:inline xmlns:a="http://schemas.openxmlformats.org/drawingml/2006/main" xmlns:pic="http://schemas.openxmlformats.org/drawingml/2006/picture">
+            <wp:extent cx="5940000" cy="5841000"/>
+            <wp:docPr id="6" name="Picture 6" descr="KIRC Full 五折总体高低风险生存曲线"/>
+            <wp:cNvGraphicFramePr>
+              <a:graphicFrameLocks noChangeAspect="1"/>
+            </wp:cNvGraphicFramePr>
+            <a:graphic>
+              <a:graphicData uri="http://schemas.openxmlformats.org/drawingml/2006/picture">
+                <pic:pic>
+                  <pic:nvPicPr>
+                    <pic:cNvPr id="0" name="km_kirc_exp6_oof.png"/>
+                    <pic:cNvPicPr/>
+                  </pic:nvPicPr>
+                  <pic:blipFill>
+                    <a:blip r:embed="rId15"/>
+                    <a:stretch>
+                      <a:fillRect/>
+                    </a:stretch>
+                  </pic:blipFill>
+                  <pic:spPr>
+                    <a:xfrm>
+                      <a:off x="0" y="0"/>
+                      <a:ext cx="5940000" cy="5841000"/>
+                    </a:xfrm>
+                    <a:prstGeom prst="rect"/>
+                  </pic:spPr>
+                </pic:pic>
+              </a:graphicData>
+            </a:graphic>
+          </wp:inline>
+        </w:drawing>
+      </w:r>
+    </w:p>
+    <w:p>
+      <w:pPr>
+        <w:keepLines/>
+        <w:spacing w:line="264" w:lineRule="auto"/>
+        <w:ind w:firstLine="0"/>
+      </w:pPr>
+      <w:r>
+        <w:rPr>
+          <w:rFonts w:ascii="Times New Roman" w:hAnsi="Times New Roman" w:eastAsia="宋体"/>
+          <w:b w:val="0"/>
+          <w:color w:val="000000"/>
+          <w:sz w:val="18"/>
+        </w:rPr>
+        <w:t>图 5b KIRC 总体高低风险 KM 曲线。共 488 名验证患者，低风险 225 人、高风险 263 人。分组与显示口径同图 5a；两图均基于验证集选择的 checkpoint，不替代独立测试或临床效用评价，当前未报告 log-rank p 值。</w:t>
       </w:r>
     </w:p>
     <w:p>
@@ -14228,7 +14373,7 @@
           <w:color w:val="000000"/>
           <w:sz w:val="21"/>
         </w:rPr>
-        <w:t>图 5 待插入后补充具体分离情况与统计量。本文不在尚无曲线时声称两组已显著分离。</w:t>
+        <w:t>两队列中，高风险组的生存曲线整体低于低风险组，呈现开发阶段的预后分层趋势。曲线末端随在险人数减少而具有更大不确定性；本次未启用 log-rank 显示，因此不报告检验 p 值或独立测试显著性。</w:t>
       </w:r>
     </w:p>
     <w:p>
@@ -14257,7 +14402,7 @@
           <w:color w:val="000000"/>
           <w:sz w:val="21"/>
         </w:rPr>
-        <w:t>病例清单和全队列 attention 尚待导出，以下固定分析流程。病例选择采用资源完整性优先、患者 ID 排序的规则，在查看结局和解释图之前冻结 BLCA/KIRC 各 1–2 名验证患者。模型导出实际采样行号、病理/组学槽 attention 与运输计划；坐标必须与原特征同行序，padding 和重复 patch 在显示阶段排除。Top-5 组织块来自原始 WSI 或可逐行索引的提取 patch，不以缩略图放大替代。</w:t>
+        <w:t>病例分析接入 BLCA 验证患者 TCGA-2F-A9KP（fold1，Full，seed=3）的导出结果，病例 ID 与 export 元数据核对一致。现有材料包含八个组学槽对 329 条通路的聚合权重，以及病理槽与组学槽的事实运输计划。完整组织解释还需要原切片或缩略图、特征与坐标同行序证据及实际 Top-5 组织块；当前资源不足，图 6 仅展示已完成的非组织子图，不赋予自动病理诊断标签。KIRC 病例组织图也暂未纳入。</w:t>
       </w:r>
     </w:p>
     <w:p>
@@ -14271,7 +14416,7 @@
           <w:color w:val="000000"/>
           <w:sz w:val="21"/>
         </w:rPr>
-        <w:t>组学槽的空间关联通过实际 OT 运输病理槽 attention 得到。设病理 attention 为 A，各阶段几何平均计划采用式（7）的定义，则：</w:t>
+        <w:t>对于后续组织图，组学槽的空间关联通过实际 OT 运输病理槽 attention 得到。设病理 attention 为 A，各阶段几何平均计划采用式（7）的定义，则：</w:t>
       </w:r>
     </w:p>
     <w:p>
@@ -14867,21 +15012,43 @@
     <w:p>
       <w:pPr>
         <w:keepNext/>
-        <w:spacing w:before="240" w:after="1280"/>
         <w:ind w:firstLine="0"/>
         <w:jc w:val="center"/>
       </w:pPr>
-      <w:bookmarkStart w:id="106" w:name="figure_pending_6"/>
       <w:r>
-        <w:rPr>
-          <w:rFonts w:ascii="Times New Roman" w:hAnsi="Times New Roman" w:eastAsia="宋体"/>
-          <w:b w:val="0"/>
-          <w:color w:val="000000"/>
-          <w:sz w:val="18"/>
-        </w:rPr>
-        <w:t>图 6 待插入</w:t>
+        <w:drawing>
+          <wp:inline xmlns:a="http://schemas.openxmlformats.org/drawingml/2006/main" xmlns:pic="http://schemas.openxmlformats.org/drawingml/2006/picture">
+            <wp:extent cx="5555041" cy="7632000"/>
+            <wp:docPr id="7" name="Picture 7" descr="BLCA 病例 TCGA-2F-A9KP 的通路到组学槽注意力矩阵"/>
+            <wp:cNvGraphicFramePr>
+              <a:graphicFrameLocks noChangeAspect="1"/>
+            </wp:cNvGraphicFramePr>
+            <a:graphic>
+              <a:graphicData uri="http://schemas.openxmlformats.org/drawingml/2006/picture">
+                <pic:pic>
+                  <pic:nvPicPr>
+                    <pic:cNvPr id="0" name="pathway_slot_map.png"/>
+                    <pic:cNvPicPr/>
+                  </pic:nvPicPr>
+                  <pic:blipFill>
+                    <a:blip r:embed="rId16"/>
+                    <a:stretch>
+                      <a:fillRect/>
+                    </a:stretch>
+                  </pic:blipFill>
+                  <pic:spPr>
+                    <a:xfrm>
+                      <a:off x="0" y="0"/>
+                      <a:ext cx="5555041" cy="7632000"/>
+                    </a:xfrm>
+                    <a:prstGeom prst="rect"/>
+                  </pic:spPr>
+                </pic:pic>
+              </a:graphicData>
+            </a:graphic>
+          </wp:inline>
+        </w:drawing>
       </w:r>
-      <w:bookmarkEnd w:id="106"/>
     </w:p>
     <w:p>
       <w:pPr>
@@ -14896,41 +15063,49 @@
           <w:color w:val="000000"/>
           <w:sz w:val="18"/>
         </w:rPr>
-        <w:t>图 6 BLCA/KIRC 验证病例的解释大图。展示 WSI 与实际采样覆盖、病理槽空间权重和 Top-5 组织块、经 OT 投影的组学槽空间权重、通路 attention 与实际运输矩阵。颜色表示关联权重，不能视为组织分割或因果贡献。缺少专家标注时不添加自动病理诊断标签。</w:t>
-      </w:r>
-    </w:p>
-    <w:p>
-      <w:pPr>
-        <w:jc w:val="both"/>
-      </w:pPr>
-      <w:r>
-        <w:rPr>
-          <w:rFonts w:ascii="Times New Roman" w:hAnsi="Times New Roman" w:eastAsia="宋体"/>
-          <w:b w:val="0"/>
-          <w:color w:val="000000"/>
-          <w:sz w:val="21"/>
-        </w:rPr>
-        <w:t>队列分析对全部验证患者导出组学槽 attention，并用每折训练风险四分位阈值划分 Q1–Q4。不同 fold 的槽编号不假设已对齐；先对每名患者的组学槽归一化 attention 等权平均，再按真实通路名称及签名定义对齐，计算风险组内患者等权均值。患者只贡献一次，删失者可按预测风险分组，其随访时间不当作已知死亡时间。</w:t>
+        <w:t>图 6a TCGA-2F-A9KP 的通路—槽聚合矩阵。列为八个组学槽，行为按最大权重槽排序的 329 条通路，颜色保留原始 attention。该图描述模型聚合关联，不代表实测基因表达或组织分割。</w:t>
       </w:r>
     </w:p>
     <w:p>
       <w:pPr>
         <w:keepNext/>
-        <w:spacing w:before="240" w:after="1280"/>
         <w:ind w:firstLine="0"/>
         <w:jc w:val="center"/>
       </w:pPr>
-      <w:bookmarkStart w:id="107" w:name="figure_pending_7"/>
       <w:r>
-        <w:rPr>
-          <w:rFonts w:ascii="Times New Roman" w:hAnsi="Times New Roman" w:eastAsia="宋体"/>
-          <w:b w:val="0"/>
-          <w:color w:val="000000"/>
-          <w:sz w:val="18"/>
-        </w:rPr>
-        <w:t>图 7 待插入</w:t>
+        <w:drawing>
+          <wp:inline xmlns:a="http://schemas.openxmlformats.org/drawingml/2006/main" xmlns:pic="http://schemas.openxmlformats.org/drawingml/2006/picture">
+            <wp:extent cx="5940000" cy="1762364"/>
+            <wp:docPr id="8" name="Picture 8" descr="BLCA 病例的学习运输计划、同边际独立计划与差值"/>
+            <wp:cNvGraphicFramePr>
+              <a:graphicFrameLocks noChangeAspect="1"/>
+            </wp:cNvGraphicFramePr>
+            <a:graphic>
+              <a:graphicData uri="http://schemas.openxmlformats.org/drawingml/2006/picture">
+                <pic:pic>
+                  <pic:nvPicPr>
+                    <pic:cNvPr id="0" name="transport_association.png"/>
+                    <pic:cNvPicPr/>
+                  </pic:nvPicPr>
+                  <pic:blipFill>
+                    <a:blip r:embed="rId17"/>
+                    <a:stretch>
+                      <a:fillRect/>
+                    </a:stretch>
+                  </pic:blipFill>
+                  <pic:spPr>
+                    <a:xfrm>
+                      <a:off x="0" y="0"/>
+                      <a:ext cx="5940000" cy="1762364"/>
+                    </a:xfrm>
+                    <a:prstGeom prst="rect"/>
+                  </pic:spPr>
+                </pic:pic>
+              </a:graphicData>
+            </a:graphic>
+          </wp:inline>
+        </w:drawing>
       </w:r>
-      <w:bookmarkEnd w:id="107"/>
     </w:p>
     <w:p>
       <w:pPr>
@@ -14945,7 +15120,7 @@
           <w:color w:val="000000"/>
           <w:sz w:val="18"/>
         </w:rPr>
-        <w:t>图 7 BLCA/KIRC 队列通路参与热图。展示训练阈值定义的验证风险四组及各组人数、事件/删失数；颜色为平均槽聚合权重。主图使用各组 Top-10 通路并集，完整矩阵放补充。风险分组不同于 SlotSPE 按观察生存时间分组的图；权重变化不解释为表达量或风险贡献变化。</w:t>
+        <w:t>图 6b 同一病例的病理槽—组学槽运输关联。左为学习运输，中央为同事实边际构造的独立计划，右为两者之差；各阶段先平均几何分支，再按事实阶段门控融合。差值矩阵的最大绝对值约为 0.0214。运输关联本身不证明因果或模块预测收益，真实组织空间图与 Top-5 组织块仍待补齐。</w:t>
       </w:r>
     </w:p>
     <w:p>
@@ -14959,7 +15134,149 @@
           <w:color w:val="000000"/>
           <w:sz w:val="21"/>
         </w:rPr>
-        <w:t>图 6–7 的病例、通路与组织含义待真实图像和必要注释到齐后填写。现有 attention 提供描述性计算关联；本文不提前指定哪类组织或通路解释了性能提升。</w:t>
+        <w:t>队列分析使用五折全部验证患者导出的组学槽 attention。各折内按验证患者预测风险的 midrank 百分位划分 Q1–Q4，从低风险到高风险排列；并列风险保留相同百分位，因此组人数不要求完全相等。该分组用于描述性队列展示，与图 5 使用训练风险中位数的高低二分口径不同。不同 fold 的槽编号不假设已对齐；先对每名患者的八个组学槽 attention 等权平均，再按真实通路名称对齐，计算组内患者等权均值。每名患者只贡献一次；删失者按预测风险分组，其随访时间不当作已知死亡时间。</w:t>
+      </w:r>
+    </w:p>
+    <w:p>
+      <w:pPr>
+        <w:jc w:val="both"/>
+      </w:pPr>
+      <w:r>
+        <w:rPr>
+          <w:rFonts w:ascii="Times New Roman" w:hAnsi="Times New Roman" w:eastAsia="宋体"/>
+          <w:b w:val="0"/>
+          <w:color w:val="000000"/>
+          <w:sz w:val="21"/>
+        </w:rPr>
+        <w:t>每组按平均 attention 选取 Top-10 通路并取并集，BLCA 共 29 条，KIRC 共 33 条。图 7 主图显示绝对注意力差值：每条通路在某风险组的平均权重，减去该通路四个风险组均值的等权平均。四组不按患者人数加权，也不做逐行标准差归一化。红色表示高于该通路的四组平均，蓝色表示低于平均；色标为绝对 attention 单位，各癌种范围分别标注。原始平均权重见补充图 S3。</w:t>
+      </w:r>
+    </w:p>
+    <w:p>
+      <w:pPr>
+        <w:keepNext/>
+        <w:ind w:firstLine="0"/>
+        <w:jc w:val="center"/>
+      </w:pPr>
+      <w:r>
+        <w:drawing>
+          <wp:inline xmlns:a="http://schemas.openxmlformats.org/drawingml/2006/main" xmlns:pic="http://schemas.openxmlformats.org/drawingml/2006/picture">
+            <wp:extent cx="5846782" cy="7631999"/>
+            <wp:docPr id="9" name="Picture 9" descr="BLCA 队列通路注意力的绝对组间差值"/>
+            <wp:cNvGraphicFramePr>
+              <a:graphicFrameLocks noChangeAspect="1"/>
+            </wp:cNvGraphicFramePr>
+            <a:graphic>
+              <a:graphicData uri="http://schemas.openxmlformats.org/drawingml/2006/picture">
+                <pic:pic>
+                  <pic:nvPicPr>
+                    <pic:cNvPr id="0" name="fig7_attention_difference_blca.png"/>
+                    <pic:cNvPicPr/>
+                  </pic:nvPicPr>
+                  <pic:blipFill>
+                    <a:blip r:embed="rId18"/>
+                    <a:stretch>
+                      <a:fillRect/>
+                    </a:stretch>
+                  </pic:blipFill>
+                  <pic:spPr>
+                    <a:xfrm>
+                      <a:off x="0" y="0"/>
+                      <a:ext cx="5846782" cy="7631999"/>
+                    </a:xfrm>
+                    <a:prstGeom prst="rect"/>
+                  </pic:spPr>
+                </pic:pic>
+              </a:graphicData>
+            </a:graphic>
+          </wp:inline>
+        </w:drawing>
+      </w:r>
+    </w:p>
+    <w:p>
+      <w:pPr>
+        <w:keepLines/>
+        <w:spacing w:line="264" w:lineRule="auto"/>
+        <w:ind w:firstLine="0"/>
+      </w:pPr>
+      <w:r>
+        <w:rPr>
+          <w:rFonts w:ascii="Times New Roman" w:hAnsi="Times New Roman" w:eastAsia="宋体"/>
+          <w:b w:val="0"/>
+          <w:color w:val="000000"/>
+          <w:sz w:val="18"/>
+        </w:rPr>
+        <w:t>图 7a BLCA 通路注意力差值。380 名验证患者的 Q1–Q4 各 95 人，显示 29 条入选通路。色标关于零对称，最大绝对差值为 3.61×10⁻⁵；未标准化为 z-score，不添加显著性星号。</w:t>
+      </w:r>
+    </w:p>
+    <w:p>
+      <w:pPr>
+        <w:keepNext/>
+        <w:ind w:firstLine="0"/>
+        <w:jc w:val="center"/>
+      </w:pPr>
+      <w:r>
+        <w:drawing>
+          <wp:inline xmlns:a="http://schemas.openxmlformats.org/drawingml/2006/main" xmlns:pic="http://schemas.openxmlformats.org/drawingml/2006/picture">
+            <wp:extent cx="5428165" cy="7632000"/>
+            <wp:docPr id="10" name="Picture 10" descr="KIRC 队列通路注意力的绝对组间差值"/>
+            <wp:cNvGraphicFramePr>
+              <a:graphicFrameLocks noChangeAspect="1"/>
+            </wp:cNvGraphicFramePr>
+            <a:graphic>
+              <a:graphicData uri="http://schemas.openxmlformats.org/drawingml/2006/picture">
+                <pic:pic>
+                  <pic:nvPicPr>
+                    <pic:cNvPr id="0" name="fig7_attention_difference_kirc.png"/>
+                    <pic:cNvPicPr/>
+                  </pic:nvPicPr>
+                  <pic:blipFill>
+                    <a:blip r:embed="rId19"/>
+                    <a:stretch>
+                      <a:fillRect/>
+                    </a:stretch>
+                  </pic:blipFill>
+                  <pic:spPr>
+                    <a:xfrm>
+                      <a:off x="0" y="0"/>
+                      <a:ext cx="5428165" cy="7632000"/>
+                    </a:xfrm>
+                    <a:prstGeom prst="rect"/>
+                  </pic:spPr>
+                </pic:pic>
+              </a:graphicData>
+            </a:graphic>
+          </wp:inline>
+        </w:drawing>
+      </w:r>
+    </w:p>
+    <w:p>
+      <w:pPr>
+        <w:keepLines/>
+        <w:spacing w:line="264" w:lineRule="auto"/>
+        <w:ind w:firstLine="0"/>
+      </w:pPr>
+      <w:r>
+        <w:rPr>
+          <w:rFonts w:ascii="Times New Roman" w:hAnsi="Times New Roman" w:eastAsia="宋体"/>
+          <w:b w:val="0"/>
+          <w:color w:val="000000"/>
+          <w:sz w:val="18"/>
+        </w:rPr>
+        <w:t>图 7b KIRC 通路注意力差值。488 名验证患者的 Q1–Q4 分别为 120、123、122、123 人，显示 33 条入选通路；最大绝对差值为 1.45×10⁻⁴。其色标范围与图 7a 不同，跨癌种比较应读取数值，不能直接比较颜色深浅。</w:t>
+      </w:r>
+    </w:p>
+    <w:p>
+      <w:pPr>
+        <w:jc w:val="both"/>
+      </w:pPr>
+      <w:r>
+        <w:rPr>
+          <w:rFonts w:ascii="Times New Roman" w:hAnsi="Times New Roman" w:eastAsia="宋体"/>
+          <w:b w:val="0"/>
+          <w:color w:val="000000"/>
+          <w:sz w:val="21"/>
+        </w:rPr>
+        <w:t>所展示通路的原始组均值在 BLCA 为 0.0030188–0.0030858，在 KIRC 为 0.0028853–0.0032756；BLCA 尤其集中，采用零起点的原始色标时呈近乎一致的红色。差值主图呈现的是这种较小的组间偏离，不能据其颜色对比声称大幅生物学差异。通路由当前验证队列的 attention 挑选，现有结果提供描述性计算关联；本文不据此指定哪类组织或通路解释了性能提升，也不把这些权重解释为基因表达量或因果风险贡献。</w:t>
       </w:r>
     </w:p>
     <w:p>
@@ -15116,7 +15433,7 @@
           <w:color w:val="000000"/>
           <w:sz w:val="21"/>
         </w:rPr>
-        <w:t>DCT 以模态内共享原型组织槽表示，在紧凑槽空间学习阶段条件多几何运输，并复用预测计划执行运输感知通路重建。UNI2-h 十队列记录的平均 C-index 为 0.7030；BLCA/KIRC 的完整目标相对同架构仅 NLL 分别提高 2.37 和 1.04 个百分点。重跑控制臂的平均比较进一步支持重建中的运输对齐和学习联合计划的任务价值。本文将这些结果限定于当前单 seed 最佳验证协议，同时报告固定模型在同边缘计划替换下的低敏感性，并通过待补的风险分层、病例与队列解释图继续检查计算机制，不将描述性热图作为因果或临床验证。</w:t>
+        <w:t>DCT 以模态内共享原型组织槽表示，在紧凑槽空间学习阶段条件多几何运输，并复用预测计划执行运输感知通路重建。UNI2-h 十队列记录的平均 C-index 为 0.7030；BLCA/KIRC 的完整目标相对同架构仅 NLL 分别提高 2.37 和 1.04 个百分点。重跑控制臂的平均比较进一步支持重建中的运输对齐和学习联合计划的任务价值。本文将这些结果限定于当前单 seed 最佳验证协议，同时报告固定模型在同边缘计划替换下的低敏感性，并结合风险分层、病例槽通路与队列注意力差值图描述模型关联；组织图与进一步机制验证仍待完整核验，不将描述性热图作为因果或临床验证。</w:t>
       </w:r>
     </w:p>
     <w:p>
@@ -15149,7 +15466,7 @@
         </w:rPr>
         <w:t xml:space="preserve">[1] Chen RJ, Lu MY, Weng WH, et al. Multimodal Co-Attention Transformer for Survival Prediction in Gigapixel Whole Slide Images. ICCV, 2021: 4015–4025. </w:t>
       </w:r>
-      <w:hyperlink r:id="rId11">
+      <w:hyperlink r:id="rId20">
         <w:r>
           <w:t>出版页面</w:t>
         </w:r>
@@ -15179,7 +15496,7 @@
         </w:rPr>
         <w:t xml:space="preserve">[2] Xu Y, Chen H. Multimodal Optimal Transport-based Co-Attention Transformer with Global Structure Consistency for Survival Prediction. ICCV, 2023. </w:t>
       </w:r>
-      <w:hyperlink r:id="rId12">
+      <w:hyperlink r:id="rId21">
         <w:r>
           <w:t>论文原文</w:t>
         </w:r>
@@ -15209,7 +15526,7 @@
         </w:rPr>
         <w:t xml:space="preserve">[3] Zhang Y, Li N, Yang C, Schmidhuber J, Gao X. Structural Prognostic Event Modeling for Multimodal Cancer Survival Analysis. ICLR, 2026; arXiv:2512.01116. </w:t>
       </w:r>
-      <w:hyperlink r:id="rId13">
+      <w:hyperlink r:id="rId22">
         <w:r>
           <w:t>作者论文</w:t>
         </w:r>
@@ -15239,7 +15556,7 @@
         </w:rPr>
         <w:t xml:space="preserve">[4] Locatello F, Weissenborn D, Unterthiner T, et al. Object-Centric Learning with Slot Attention. NeurIPS, 2020. </w:t>
       </w:r>
-      <w:hyperlink r:id="rId14">
+      <w:hyperlink r:id="rId23">
         <w:r>
           <w:t>出版页面</w:t>
         </w:r>
@@ -15269,7 +15586,7 @@
         </w:rPr>
         <w:t xml:space="preserve">[5] Cuturi M. Sinkhorn Distances: Lightspeed Computation of Optimal Transport. NeurIPS, 2013. </w:t>
       </w:r>
-      <w:hyperlink r:id="rId15">
+      <w:hyperlink r:id="rId24">
         <w:r>
           <w:t>出版页面</w:t>
         </w:r>
@@ -15299,7 +15616,7 @@
         </w:rPr>
         <w:t xml:space="preserve">[6] Gensheimer MF, Narasimhan B. A scalable discrete-time survival model for neural networks. PeerJ, 2019;7:e6257. </w:t>
       </w:r>
-      <w:hyperlink r:id="rId16">
+      <w:hyperlink r:id="rId25">
         <w:r>
           <w:t>论文原文</w:t>
         </w:r>
@@ -15329,7 +15646,7 @@
         </w:rPr>
         <w:t xml:space="preserve">[7] Uno H, Cai T, Pencina MJ, D’Agostino RB, Wei LJ. On the C-statistics for evaluating overall adequacy of risk prediction procedures with censored survival data. Statistics in Medicine, 2011;30:1105–1117. </w:t>
       </w:r>
-      <w:hyperlink r:id="rId17">
+      <w:hyperlink r:id="rId26">
         <w:r>
           <w:t>开放原文</w:t>
         </w:r>
@@ -15359,7 +15676,7 @@
         </w:rPr>
         <w:t xml:space="preserve">[8] Mahmood Lab. UNI and UNI2 official model repository. </w:t>
       </w:r>
-      <w:hyperlink r:id="rId18">
+      <w:hyperlink r:id="rId27">
         <w:r>
           <w:t>官方模型与版本说明</w:t>
         </w:r>
@@ -20146,7 +20463,7 @@
           <w:color w:val="000000"/>
           <w:sz w:val="21"/>
         </w:rPr>
-        <w:t>图 4 已接入 commit 24f3f10 提交的十折 sweep JSON，图 1–3、5–7 保留空位。图 4 的论文版仅从这些 JSON 重绘，将旧图内的 Figure 3 标签去除，并统一使用样本标准差；未运行模型。源 JSON 没有 schema_version、checkpoint hash、患者清单、训练人数或逐患者最佳预测对齐记录，日期按 Git 提交 2026-10-07 标识，不能用本地检出时间推断服务器训练时间。原始图和 JSON 保留。尚无真实图时不写病例通路、KM 显著性或效率数值。其余图像到齐后，须核对 source_data、患者/fold、checkpoint、单位、通路名和颜色，再完成对应结果段。</w:t>
+        <w:t>图 1–7 已接入现有真实数值或代码对应示意，其中图 6 仅包含已完成的 BLCA 病例通路和运输子图，组织空间图、Top-5 组织块与 KIRC 病例图仍待补齐。图 2、3、7 与补充图 S3 由已保存记录重绘，原始图片和 JSON 保留，来源 hash 与数值快照见 figures/v313_manuscript_integrated/manifest.json。图 3 差值按未四舍五入的原始折值计算；原稿先对均值四舍五入再相减产生的末位差异同步修正，实验成绩不变。图 4 继续使用 commit 24f3f10 的十折 sweep JSON，缺少患者级最佳预测对齐与边缘残差记录的限制保持不变。图 5 与图 7 分别使用训练风险中位数和折内验证风险百分位分组；人数以对应患者 JSON/CSV 为准，不采用历史执行报告中的不一致组数。新增服务器实验的进度报告不替代原始逐折结果，未将尚未同步核验的结论填入正文。本次论文接图不运行模型，也不填写未经实测的 KM 显著性、组织诊断或效率优势。</w:t>
       </w:r>
     </w:p>
     <w:p>
@@ -20470,7 +20787,7 @@
                 <w:color w:val="000000"/>
                 <w:sz w:val="19"/>
               </w:rPr>
-              <w:t>结果 4.4</w:t>
+              <w:t>结果 4.4，已插入</w:t>
             </w:r>
           </w:p>
         </w:tc>
@@ -20505,7 +20822,7 @@
                 <w:color w:val="000000"/>
                 <w:sz w:val="19"/>
               </w:rPr>
-              <w:t>Exp0–Exp6 五折数值，误差口径与支路权重</w:t>
+              <w:t>Exp0–Exp6 五折分布、样本标准差与历史支路权重</w:t>
             </w:r>
           </w:p>
         </w:tc>
@@ -20580,7 +20897,7 @@
                 <w:color w:val="000000"/>
                 <w:sz w:val="19"/>
               </w:rPr>
-              <w:t>结果 4.5</w:t>
+              <w:t>结果 4.5，已插入</w:t>
             </w:r>
           </w:p>
         </w:tc>
@@ -20615,7 +20932,7 @@
                 <w:color w:val="000000"/>
                 <w:sz w:val="19"/>
               </w:rPr>
-              <w:t>同折 Full/Direct/Independent 数值、配对条件说明</w:t>
+              <w:t>事实 sweep Full 与审计控制臂折值；Full-control 配对核对仍待完成</w:t>
             </w:r>
           </w:p>
         </w:tc>
@@ -20800,7 +21117,7 @@
                 <w:color w:val="000000"/>
                 <w:sz w:val="19"/>
               </w:rPr>
-              <w:t>结果 4.9，总体两组</w:t>
+              <w:t>结果 4.9，已插入两面板</w:t>
             </w:r>
           </w:p>
         </w:tc>
@@ -20835,7 +21152,7 @@
                 <w:color w:val="000000"/>
                 <w:sz w:val="19"/>
               </w:rPr>
-              <w:t>全五折验证风险/结局、各折训练阈值、患者去重清单与在险人数</w:t>
+              <w:t>全五折验证风险/结局、各折训练阈值、患者清单与在险人数</w:t>
             </w:r>
           </w:p>
         </w:tc>
@@ -20910,7 +21227,7 @@
                 <w:color w:val="000000"/>
                 <w:sz w:val="19"/>
               </w:rPr>
-              <w:t>结果 4.10</w:t>
+              <w:t>结果 4.10，非组织子图已插入</w:t>
             </w:r>
           </w:p>
         </w:tc>
@@ -20945,7 +21262,7 @@
                 <w:color w:val="000000"/>
                 <w:sz w:val="19"/>
               </w:rPr>
-              <w:t>病例 ID、原坐标、采样行、Top-5 图像、通路名和计划</w:t>
+              <w:t>BLCA 病例 ID、通路与实际运输；原坐标、组织图、Top-5 及 KIRC 病例待补</w:t>
             </w:r>
           </w:p>
         </w:tc>
@@ -21020,7 +21337,7 @@
                 <w:color w:val="000000"/>
                 <w:sz w:val="19"/>
               </w:rPr>
-              <w:t>结果 4.10</w:t>
+              <w:t>结果 4.10，已插入两面板</w:t>
             </w:r>
           </w:p>
         </w:tc>
@@ -21055,7 +21372,7 @@
                 <w:color w:val="000000"/>
                 <w:sz w:val="19"/>
               </w:rPr>
-              <w:t>全验证患者 attention、训练四分位、组人数与原始矩阵</w:t>
+              <w:t>折内验证风险百分位四组、绝对 attention 差值、组人数及原始矩阵</w:t>
             </w:r>
           </w:p>
         </w:tc>
@@ -21072,7 +21389,150 @@
           <w:color w:val="000000"/>
           <w:sz w:val="21"/>
         </w:rPr>
-        <w:t>补充的槽诊断与效率图在获得真实结果后编号为 S1、S2；校准或临床图按数据支持另行接入，不占用主图编号。所有预留图保留描述方法的图注，涉及观察结果的句子在图片与数值核验后填写。</w:t>
+        <w:t>槽诊断与效率图 S1、S2 仍待正式结果；原始队列通路平均权重已接入补充图 S3。校准或临床图按数据支持另行接入。真实组织图未完成的状态单独记录，不以已经插入的非组织病例子图替代。</w:t>
+      </w:r>
+    </w:p>
+    <w:p>
+      <w:pPr>
+        <w:pStyle w:val="Heading1"/>
+        <w:ind w:firstLine="0"/>
+      </w:pPr>
+      <w:r>
+        <w:rPr>
+          <w:rFonts w:ascii="Times New Roman" w:hAnsi="Times New Roman" w:eastAsia="黑体"/>
+          <w:b/>
+          <w:color w:val="000000"/>
+          <w:sz w:val="26"/>
+        </w:rPr>
+        <w:t>附录 D 原始通路注意力</w:t>
+      </w:r>
+    </w:p>
+    <w:p>
+      <w:pPr>
+        <w:jc w:val="both"/>
+      </w:pPr>
+      <w:r>
+        <w:rPr>
+          <w:rFonts w:ascii="Times New Roman" w:hAnsi="Times New Roman" w:eastAsia="宋体"/>
+          <w:b w:val="0"/>
+          <w:color w:val="000000"/>
+          <w:sz w:val="21"/>
+        </w:rPr>
+        <w:t>补充图 S3 保留与图 7 同一患者、同一通路顺序和同一组均值的原始平均权重。色标从零开始，显示绝对 attention，因数值集中而呈近乎一致的红色；未为增强对比改变原始权重或对行进行标准化。原始均值与图 7 的差值矩阵均保留在来源 JSON 及本次作图数值快照中。</w:t>
+      </w:r>
+    </w:p>
+    <w:p>
+      <w:pPr>
+        <w:keepNext/>
+        <w:ind w:firstLine="0"/>
+        <w:jc w:val="center"/>
+      </w:pPr>
+      <w:r>
+        <w:drawing>
+          <wp:inline xmlns:a="http://schemas.openxmlformats.org/drawingml/2006/main" xmlns:pic="http://schemas.openxmlformats.org/drawingml/2006/picture">
+            <wp:extent cx="5846782" cy="7631999"/>
+            <wp:docPr id="11" name="Picture 11" descr="BLCA 队列通路的原始平均注意力"/>
+            <wp:cNvGraphicFramePr>
+              <a:graphicFrameLocks noChangeAspect="1"/>
+            </wp:cNvGraphicFramePr>
+            <a:graphic>
+              <a:graphicData uri="http://schemas.openxmlformats.org/drawingml/2006/picture">
+                <pic:pic>
+                  <pic:nvPicPr>
+                    <pic:cNvPr id="0" name="figS3_raw_attention_blca.png"/>
+                    <pic:cNvPicPr/>
+                  </pic:nvPicPr>
+                  <pic:blipFill>
+                    <a:blip r:embed="rId28"/>
+                    <a:stretch>
+                      <a:fillRect/>
+                    </a:stretch>
+                  </pic:blipFill>
+                  <pic:spPr>
+                    <a:xfrm>
+                      <a:off x="0" y="0"/>
+                      <a:ext cx="5846782" cy="7631999"/>
+                    </a:xfrm>
+                    <a:prstGeom prst="rect"/>
+                  </pic:spPr>
+                </pic:pic>
+              </a:graphicData>
+            </a:graphic>
+          </wp:inline>
+        </w:drawing>
+      </w:r>
+    </w:p>
+    <w:p>
+      <w:pPr>
+        <w:keepLines/>
+        <w:spacing w:line="264" w:lineRule="auto"/>
+        <w:ind w:firstLine="0"/>
+      </w:pPr>
+      <w:r>
+        <w:rPr>
+          <w:rFonts w:ascii="Times New Roman" w:hAnsi="Times New Roman" w:eastAsia="宋体"/>
+          <w:b w:val="0"/>
+          <w:color w:val="000000"/>
+          <w:sz w:val="18"/>
+        </w:rPr>
+        <w:t>图 S3a BLCA 四风险组的原始平均通路 attention，组别和通路与图 7a 一致；数值范围为 0.0030188–0.0030858。</w:t>
+      </w:r>
+    </w:p>
+    <w:p>
+      <w:pPr>
+        <w:keepNext/>
+        <w:ind w:firstLine="0"/>
+        <w:jc w:val="center"/>
+      </w:pPr>
+      <w:r>
+        <w:drawing>
+          <wp:inline xmlns:a="http://schemas.openxmlformats.org/drawingml/2006/main" xmlns:pic="http://schemas.openxmlformats.org/drawingml/2006/picture">
+            <wp:extent cx="5428165" cy="7632000"/>
+            <wp:docPr id="12" name="Picture 12" descr="KIRC 队列通路的原始平均注意力"/>
+            <wp:cNvGraphicFramePr>
+              <a:graphicFrameLocks noChangeAspect="1"/>
+            </wp:cNvGraphicFramePr>
+            <a:graphic>
+              <a:graphicData uri="http://schemas.openxmlformats.org/drawingml/2006/picture">
+                <pic:pic>
+                  <pic:nvPicPr>
+                    <pic:cNvPr id="0" name="figS3_raw_attention_kirc.png"/>
+                    <pic:cNvPicPr/>
+                  </pic:nvPicPr>
+                  <pic:blipFill>
+                    <a:blip r:embed="rId29"/>
+                    <a:stretch>
+                      <a:fillRect/>
+                    </a:stretch>
+                  </pic:blipFill>
+                  <pic:spPr>
+                    <a:xfrm>
+                      <a:off x="0" y="0"/>
+                      <a:ext cx="5428165" cy="7632000"/>
+                    </a:xfrm>
+                    <a:prstGeom prst="rect"/>
+                  </pic:spPr>
+                </pic:pic>
+              </a:graphicData>
+            </a:graphic>
+          </wp:inline>
+        </w:drawing>
+      </w:r>
+    </w:p>
+    <w:p>
+      <w:pPr>
+        <w:keepLines/>
+        <w:spacing w:line="264" w:lineRule="auto"/>
+        <w:ind w:firstLine="0"/>
+      </w:pPr>
+      <w:r>
+        <w:rPr>
+          <w:rFonts w:ascii="Times New Roman" w:hAnsi="Times New Roman" w:eastAsia="宋体"/>
+          <w:b w:val="0"/>
+          <w:color w:val="000000"/>
+          <w:sz w:val="18"/>
+        </w:rPr>
+        <w:t>图 S3b KIRC 四风险组的原始平均通路 attention，组别和通路与图 7b 一致；数值范围为 0.0028853–0.0032756。</w:t>
       </w:r>
     </w:p>
     <w:sectPr>

</xml_diff>

<commit_message>
paper: fill ten-cancer published comparison and integrate v313 ranks
</commit_message>
<xml_diff>
--- a/paper/DCT_v313_初稿.docx
+++ b/paper/DCT_v313_初稿.docx
@@ -5859,7 +5859,7 @@
           <w:color w:val="000000"/>
           <w:sz w:val="21"/>
         </w:rPr>
-        <w:t>现有主要记录包含十队列 50 个 Full 折值、BLCA/KIRC 的 70 个损失消融折值，以及重跑并审计的 20 个机制控制臂折值。Full 在前两类记录中复用，不能将这些数量直接相加为独立训练次数。外部基线按其真实 native/matched 配方分别列示，不逐折挑取两种配方中的最高分。全部结果的来源与尚需补齐的材料见附录 B。</w:t>
+        <w:t>现有主要记录包含十队列 50 个 Full 折值、BLCA/KIRC 的 70 个损失消融折值，以及重跑并审计的 20 个机制控制臂折值。Full 在前两类记录中复用，不能将这些数量直接相加为独立训练次数。外部方法的公开报告值在表 2 中完整列示，编码器与患者划分差异在表注中说明。同条件 native/matched 实验需按其真实配方另行核对，不逐折择优。全部结果的来源与尚需补齐的材料见附录 B。</w:t>
       </w:r>
     </w:p>
     <w:p>
@@ -8722,608 +8722,50 @@
           <w:color w:val="000000"/>
           <w:sz w:val="21"/>
         </w:rPr>
-        <w:t>外部比较以 SlotSPE 为首要参照，其槽表示与跨模态重建使它能够检验 DCT 相对已有结构化预后建模的增益 [3]。native 配方用于保留原方法训练设定，matched 配方用于尽可能匹配编码器、患者划分、采样、训练预算和 checkpoint 选择。两种结果分别报告。</w:t>
+        <w:t>表 2 汇总 SlotSPE 原论文表 1 中 18 个方法的十队列报告值，并加入本文 DCT v3.13 的五折均值 [3]。基线数值从原论文 PDF 第 7 页直接提取，十队列均值另与第 22 页附录表 4 交叉核对，标准差保留在配套数值文件中。组学、病理和多模态方法均纳入逐列排名，没有只在多模态方法中选择最高值。</w:t>
       </w:r>
     </w:p>
-    <w:tbl>
-      <w:tblPr>
-        <w:tblW w:type="auto" w:w="0"/>
+    <w:p>
+      <w:pPr>
+        <w:keepNext/>
+        <w:ind w:firstLine="0"/>
         <w:jc w:val="center"/>
-        <w:tblLayout w:type="fixed"/>
-        <w:tblLook w:firstColumn="1" w:firstRow="1" w:lastColumn="0" w:lastRow="0" w:noHBand="0" w:noVBand="1" w:val="04A0"/>
-      </w:tblPr>
-      <w:tblGrid>
-        <w:gridCol w:w="1928"/>
-        <w:gridCol w:w="1871"/>
-        <w:gridCol w:w="2835"/>
-        <w:gridCol w:w="2835"/>
-      </w:tblGrid>
-      <w:tr>
-        <w:trPr>
-          <w:cantSplit/>
-          <w:tblHeader/>
-        </w:trPr>
-        <w:tc>
-          <w:tcPr>
-            <w:tcW w:type="dxa" w:w="1928"/>
-            <w:vAlign w:val="center"/>
-            <w:shd w:fill="EDEFF2"/>
-            <w:tcBorders>
-              <w:top w:val="single" w:sz="4" w:color="D9D9D9"/>
-              <w:bottom w:val="single" w:sz="4" w:color="D9D9D9"/>
-              <w:left w:val="single" w:sz="4" w:color="D9D9D9"/>
-              <w:right w:val="single" w:sz="4" w:color="D9D9D9"/>
-            </w:tcBorders>
-            <w:tcMar>
-              <w:top w:w="70" w:type="dxa"/>
-              <w:bottom w:w="70" w:type="dxa"/>
-              <w:left w:w="70" w:type="dxa"/>
-              <w:right w:w="70" w:type="dxa"/>
-            </w:tcMar>
-          </w:tcPr>
-          <w:p>
-            <w:pPr>
-              <w:keepNext/>
-              <w:spacing w:line="259" w:lineRule="auto" w:after="80" w:before="80"/>
-              <w:ind w:firstLine="0"/>
-              <w:jc w:val="center"/>
-            </w:pPr>
-            <w:r>
-              <w:rPr>
-                <w:rFonts w:ascii="Times New Roman" w:hAnsi="Times New Roman" w:eastAsia="宋体"/>
-                <w:b/>
-                <w:color w:val="000000"/>
-                <w:sz w:val="19"/>
-              </w:rPr>
-              <w:t>方法</w:t>
-            </w:r>
-          </w:p>
-        </w:tc>
-        <w:tc>
-          <w:tcPr>
-            <w:tcW w:type="dxa" w:w="1871"/>
-            <w:vAlign w:val="center"/>
-            <w:shd w:fill="EDEFF2"/>
-            <w:tcBorders>
-              <w:top w:val="single" w:sz="4" w:color="D9D9D9"/>
-              <w:bottom w:val="single" w:sz="4" w:color="D9D9D9"/>
-              <w:left w:val="single" w:sz="4" w:color="D9D9D9"/>
-              <w:right w:val="single" w:sz="4" w:color="D9D9D9"/>
-            </w:tcBorders>
-            <w:tcMar>
-              <w:top w:w="70" w:type="dxa"/>
-              <w:bottom w:w="70" w:type="dxa"/>
-              <w:left w:w="70" w:type="dxa"/>
-              <w:right w:w="70" w:type="dxa"/>
-            </w:tcMar>
-          </w:tcPr>
-          <w:p>
-            <w:pPr>
-              <w:keepNext/>
-              <w:spacing w:line="259" w:lineRule="auto" w:after="80" w:before="80"/>
-              <w:ind w:firstLine="0"/>
-              <w:jc w:val="center"/>
-            </w:pPr>
-            <w:r>
-              <w:rPr>
-                <w:rFonts w:ascii="Times New Roman" w:hAnsi="Times New Roman" w:eastAsia="宋体"/>
-                <w:b/>
-                <w:color w:val="000000"/>
-                <w:sz w:val="19"/>
-              </w:rPr>
-              <w:t>配方</w:t>
-            </w:r>
-          </w:p>
-        </w:tc>
-        <w:tc>
-          <w:tcPr>
-            <w:tcW w:type="dxa" w:w="2835"/>
-            <w:vAlign w:val="center"/>
-            <w:shd w:fill="EDEFF2"/>
-            <w:tcBorders>
-              <w:top w:val="single" w:sz="4" w:color="D9D9D9"/>
-              <w:bottom w:val="single" w:sz="4" w:color="D9D9D9"/>
-              <w:left w:val="single" w:sz="4" w:color="D9D9D9"/>
-              <w:right w:val="single" w:sz="4" w:color="D9D9D9"/>
-            </w:tcBorders>
-            <w:tcMar>
-              <w:top w:w="70" w:type="dxa"/>
-              <w:bottom w:w="70" w:type="dxa"/>
-              <w:left w:w="70" w:type="dxa"/>
-              <w:right w:w="70" w:type="dxa"/>
-            </w:tcMar>
-          </w:tcPr>
-          <w:p>
-            <w:pPr>
-              <w:keepNext/>
-              <w:spacing w:line="259" w:lineRule="auto" w:after="80" w:before="80"/>
-              <w:ind w:firstLine="0"/>
-              <w:jc w:val="center"/>
-            </w:pPr>
-            <w:r>
-              <w:rPr>
-                <w:rFonts w:ascii="Times New Roman" w:hAnsi="Times New Roman" w:eastAsia="宋体"/>
-                <w:b/>
-                <w:color w:val="000000"/>
-                <w:sz w:val="19"/>
-              </w:rPr>
-              <w:t>BLCA C-index</w:t>
-            </w:r>
-          </w:p>
-        </w:tc>
-        <w:tc>
-          <w:tcPr>
-            <w:tcW w:type="dxa" w:w="2835"/>
-            <w:vAlign w:val="center"/>
-            <w:shd w:fill="EDEFF2"/>
-            <w:tcBorders>
-              <w:top w:val="single" w:sz="4" w:color="D9D9D9"/>
-              <w:bottom w:val="single" w:sz="4" w:color="D9D9D9"/>
-              <w:left w:val="single" w:sz="4" w:color="D9D9D9"/>
-              <w:right w:val="single" w:sz="4" w:color="D9D9D9"/>
-            </w:tcBorders>
-            <w:tcMar>
-              <w:top w:w="70" w:type="dxa"/>
-              <w:bottom w:w="70" w:type="dxa"/>
-              <w:left w:w="70" w:type="dxa"/>
-              <w:right w:w="70" w:type="dxa"/>
-            </w:tcMar>
-          </w:tcPr>
-          <w:p>
-            <w:pPr>
-              <w:keepNext/>
-              <w:spacing w:line="259" w:lineRule="auto" w:after="80" w:before="80"/>
-              <w:ind w:firstLine="0"/>
-              <w:jc w:val="center"/>
-            </w:pPr>
-            <w:r>
-              <w:rPr>
-                <w:rFonts w:ascii="Times New Roman" w:hAnsi="Times New Roman" w:eastAsia="宋体"/>
-                <w:b/>
-                <w:color w:val="000000"/>
-                <w:sz w:val="19"/>
-              </w:rPr>
-              <w:t>KIRC C-index</w:t>
-            </w:r>
-          </w:p>
-        </w:tc>
-      </w:tr>
-      <w:tr>
-        <w:trPr>
-          <w:cantSplit/>
-        </w:trPr>
-        <w:tc>
-          <w:tcPr>
-            <w:tcW w:type="dxa" w:w="1928"/>
-            <w:vAlign w:val="center"/>
-            <w:tcBorders>
-              <w:top w:val="single" w:sz="4" w:color="D9D9D9"/>
-              <w:bottom w:val="single" w:sz="4" w:color="D9D9D9"/>
-              <w:left w:val="single" w:sz="4" w:color="D9D9D9"/>
-              <w:right w:val="single" w:sz="4" w:color="D9D9D9"/>
-            </w:tcBorders>
-            <w:tcMar>
-              <w:top w:w="70" w:type="dxa"/>
-              <w:bottom w:w="70" w:type="dxa"/>
-              <w:left w:w="70" w:type="dxa"/>
-              <w:right w:w="70" w:type="dxa"/>
-            </w:tcMar>
-          </w:tcPr>
-          <w:p>
-            <w:pPr>
-              <w:keepNext/>
-              <w:spacing w:line="259" w:lineRule="auto" w:after="80" w:before="80"/>
-              <w:ind w:firstLine="0"/>
-              <w:jc w:val="center"/>
-            </w:pPr>
-            <w:r>
-              <w:rPr>
-                <w:rFonts w:ascii="Times New Roman" w:hAnsi="Times New Roman" w:eastAsia="宋体"/>
-                <w:b w:val="0"/>
-                <w:color w:val="000000"/>
-                <w:sz w:val="19"/>
-              </w:rPr>
-              <w:t>DCT Full</w:t>
-            </w:r>
-          </w:p>
-        </w:tc>
-        <w:tc>
-          <w:tcPr>
-            <w:tcW w:type="dxa" w:w="1871"/>
-            <w:vAlign w:val="center"/>
-            <w:tcBorders>
-              <w:top w:val="single" w:sz="4" w:color="D9D9D9"/>
-              <w:bottom w:val="single" w:sz="4" w:color="D9D9D9"/>
-              <w:left w:val="single" w:sz="4" w:color="D9D9D9"/>
-              <w:right w:val="single" w:sz="4" w:color="D9D9D9"/>
-            </w:tcBorders>
-            <w:tcMar>
-              <w:top w:w="70" w:type="dxa"/>
-              <w:bottom w:w="70" w:type="dxa"/>
-              <w:left w:w="70" w:type="dxa"/>
-              <w:right w:w="70" w:type="dxa"/>
-            </w:tcMar>
-          </w:tcPr>
-          <w:p>
-            <w:pPr>
-              <w:keepNext/>
-              <w:spacing w:line="259" w:lineRule="auto" w:after="80" w:before="80"/>
-              <w:ind w:firstLine="0"/>
-              <w:jc w:val="center"/>
-            </w:pPr>
-            <w:r>
-              <w:rPr>
-                <w:rFonts w:ascii="Times New Roman" w:hAnsi="Times New Roman" w:eastAsia="宋体"/>
-                <w:b w:val="0"/>
-                <w:color w:val="000000"/>
-                <w:sz w:val="19"/>
-              </w:rPr>
-              <w:t>本文完整配置</w:t>
-            </w:r>
-          </w:p>
-        </w:tc>
-        <w:tc>
-          <w:tcPr>
-            <w:tcW w:type="dxa" w:w="2835"/>
-            <w:vAlign w:val="center"/>
-            <w:tcBorders>
-              <w:top w:val="single" w:sz="4" w:color="D9D9D9"/>
-              <w:bottom w:val="single" w:sz="4" w:color="D9D9D9"/>
-              <w:left w:val="single" w:sz="4" w:color="D9D9D9"/>
-              <w:right w:val="single" w:sz="4" w:color="D9D9D9"/>
-            </w:tcBorders>
-            <w:tcMar>
-              <w:top w:w="70" w:type="dxa"/>
-              <w:bottom w:w="70" w:type="dxa"/>
-              <w:left w:w="70" w:type="dxa"/>
-              <w:right w:w="70" w:type="dxa"/>
-            </w:tcMar>
-          </w:tcPr>
-          <w:p>
-            <w:pPr>
-              <w:keepNext/>
-              <w:spacing w:line="259" w:lineRule="auto" w:after="80" w:before="80"/>
-              <w:ind w:firstLine="0"/>
-              <w:jc w:val="center"/>
-            </w:pPr>
-            <w:r>
-              <w:rPr>
-                <w:rFonts w:ascii="Times New Roman" w:hAnsi="Times New Roman" w:eastAsia="宋体"/>
-                <w:b w:val="0"/>
-                <w:color w:val="000000"/>
-                <w:sz w:val="19"/>
-              </w:rPr>
-              <w:t>0.7238 ± 0.0467</w:t>
-            </w:r>
-          </w:p>
-        </w:tc>
-        <w:tc>
-          <w:tcPr>
-            <w:tcW w:type="dxa" w:w="2835"/>
-            <w:vAlign w:val="center"/>
-            <w:tcBorders>
-              <w:top w:val="single" w:sz="4" w:color="D9D9D9"/>
-              <w:bottom w:val="single" w:sz="4" w:color="D9D9D9"/>
-              <w:left w:val="single" w:sz="4" w:color="D9D9D9"/>
-              <w:right w:val="single" w:sz="4" w:color="D9D9D9"/>
-            </w:tcBorders>
-            <w:tcMar>
-              <w:top w:w="70" w:type="dxa"/>
-              <w:bottom w:w="70" w:type="dxa"/>
-              <w:left w:w="70" w:type="dxa"/>
-              <w:right w:w="70" w:type="dxa"/>
-            </w:tcMar>
-          </w:tcPr>
-          <w:p>
-            <w:pPr>
-              <w:keepNext/>
-              <w:spacing w:line="259" w:lineRule="auto" w:after="80" w:before="80"/>
-              <w:ind w:firstLine="0"/>
-              <w:jc w:val="center"/>
-            </w:pPr>
-            <w:r>
-              <w:rPr>
-                <w:rFonts w:ascii="Times New Roman" w:hAnsi="Times New Roman" w:eastAsia="宋体"/>
-                <w:b w:val="0"/>
-                <w:color w:val="000000"/>
-                <w:sz w:val="19"/>
-              </w:rPr>
-              <w:t>0.8224 ± 0.0163</w:t>
-            </w:r>
-          </w:p>
-        </w:tc>
-      </w:tr>
-      <w:tr>
-        <w:trPr>
-          <w:cantSplit/>
-        </w:trPr>
-        <w:tc>
-          <w:tcPr>
-            <w:tcW w:type="dxa" w:w="1928"/>
-            <w:vAlign w:val="center"/>
-            <w:tcBorders>
-              <w:top w:val="single" w:sz="4" w:color="D9D9D9"/>
-              <w:bottom w:val="single" w:sz="4" w:color="D9D9D9"/>
-              <w:left w:val="single" w:sz="4" w:color="D9D9D9"/>
-              <w:right w:val="single" w:sz="4" w:color="D9D9D9"/>
-            </w:tcBorders>
-            <w:tcMar>
-              <w:top w:w="70" w:type="dxa"/>
-              <w:bottom w:w="70" w:type="dxa"/>
-              <w:left w:w="70" w:type="dxa"/>
-              <w:right w:w="70" w:type="dxa"/>
-            </w:tcMar>
-          </w:tcPr>
-          <w:p>
-            <w:pPr>
-              <w:keepNext/>
-              <w:spacing w:line="259" w:lineRule="auto" w:after="80" w:before="80"/>
-              <w:ind w:firstLine="0"/>
-              <w:jc w:val="center"/>
-            </w:pPr>
-            <w:r>
-              <w:rPr>
-                <w:rFonts w:ascii="Times New Roman" w:hAnsi="Times New Roman" w:eastAsia="宋体"/>
-                <w:b w:val="0"/>
-                <w:color w:val="000000"/>
-                <w:sz w:val="19"/>
-              </w:rPr>
-              <w:t>SlotSPE</w:t>
-            </w:r>
-          </w:p>
-        </w:tc>
-        <w:tc>
-          <w:tcPr>
-            <w:tcW w:type="dxa" w:w="1871"/>
-            <w:vAlign w:val="center"/>
-            <w:tcBorders>
-              <w:top w:val="single" w:sz="4" w:color="D9D9D9"/>
-              <w:bottom w:val="single" w:sz="4" w:color="D9D9D9"/>
-              <w:left w:val="single" w:sz="4" w:color="D9D9D9"/>
-              <w:right w:val="single" w:sz="4" w:color="D9D9D9"/>
-            </w:tcBorders>
-            <w:tcMar>
-              <w:top w:w="70" w:type="dxa"/>
-              <w:bottom w:w="70" w:type="dxa"/>
-              <w:left w:w="70" w:type="dxa"/>
-              <w:right w:w="70" w:type="dxa"/>
-            </w:tcMar>
-          </w:tcPr>
-          <w:p>
-            <w:pPr>
-              <w:keepNext/>
-              <w:spacing w:line="259" w:lineRule="auto" w:after="80" w:before="80"/>
-              <w:ind w:firstLine="0"/>
-              <w:jc w:val="center"/>
-            </w:pPr>
-            <w:r>
-              <w:rPr>
-                <w:rFonts w:ascii="Times New Roman" w:hAnsi="Times New Roman" w:eastAsia="宋体"/>
-                <w:b w:val="0"/>
-                <w:color w:val="000000"/>
-                <w:sz w:val="19"/>
-              </w:rPr>
-              <w:t>matched</w:t>
-            </w:r>
-          </w:p>
-        </w:tc>
-        <w:tc>
-          <w:tcPr>
-            <w:tcW w:type="dxa" w:w="2835"/>
-            <w:vAlign w:val="center"/>
-            <w:tcBorders>
-              <w:top w:val="single" w:sz="4" w:color="D9D9D9"/>
-              <w:bottom w:val="single" w:sz="4" w:color="D9D9D9"/>
-              <w:left w:val="single" w:sz="4" w:color="D9D9D9"/>
-              <w:right w:val="single" w:sz="4" w:color="D9D9D9"/>
-            </w:tcBorders>
-            <w:tcMar>
-              <w:top w:w="70" w:type="dxa"/>
-              <w:bottom w:w="70" w:type="dxa"/>
-              <w:left w:w="70" w:type="dxa"/>
-              <w:right w:w="70" w:type="dxa"/>
-            </w:tcMar>
-          </w:tcPr>
-          <w:p>
-            <w:pPr>
-              <w:keepNext/>
-              <w:spacing w:line="259" w:lineRule="auto" w:after="80" w:before="80"/>
-              <w:ind w:firstLine="0"/>
-              <w:jc w:val="center"/>
-            </w:pPr>
-            <w:r>
-              <w:rPr>
-                <w:rFonts w:ascii="Times New Roman" w:hAnsi="Times New Roman" w:eastAsia="宋体"/>
-                <w:b w:val="0"/>
-                <w:color w:val="000000"/>
-                <w:sz w:val="19"/>
-              </w:rPr>
-              <w:t>待补齐逐折记录</w:t>
-            </w:r>
-          </w:p>
-        </w:tc>
-        <w:tc>
-          <w:tcPr>
-            <w:tcW w:type="dxa" w:w="2835"/>
-            <w:vAlign w:val="center"/>
-            <w:tcBorders>
-              <w:top w:val="single" w:sz="4" w:color="D9D9D9"/>
-              <w:bottom w:val="single" w:sz="4" w:color="D9D9D9"/>
-              <w:left w:val="single" w:sz="4" w:color="D9D9D9"/>
-              <w:right w:val="single" w:sz="4" w:color="D9D9D9"/>
-            </w:tcBorders>
-            <w:tcMar>
-              <w:top w:w="70" w:type="dxa"/>
-              <w:bottom w:w="70" w:type="dxa"/>
-              <w:left w:w="70" w:type="dxa"/>
-              <w:right w:w="70" w:type="dxa"/>
-            </w:tcMar>
-          </w:tcPr>
-          <w:p>
-            <w:pPr>
-              <w:keepNext/>
-              <w:spacing w:line="259" w:lineRule="auto" w:after="80" w:before="80"/>
-              <w:ind w:firstLine="0"/>
-              <w:jc w:val="center"/>
-            </w:pPr>
-            <w:r>
-              <w:rPr>
-                <w:rFonts w:ascii="Times New Roman" w:hAnsi="Times New Roman" w:eastAsia="宋体"/>
-                <w:b w:val="0"/>
-                <w:color w:val="000000"/>
-                <w:sz w:val="19"/>
-              </w:rPr>
-              <w:t>待补齐逐折记录</w:t>
-            </w:r>
-          </w:p>
-        </w:tc>
-      </w:tr>
-      <w:tr>
-        <w:trPr>
-          <w:cantSplit/>
-        </w:trPr>
-        <w:tc>
-          <w:tcPr>
-            <w:tcW w:type="dxa" w:w="1928"/>
-            <w:vAlign w:val="center"/>
-            <w:tcBorders>
-              <w:top w:val="single" w:sz="4" w:color="D9D9D9"/>
-              <w:bottom w:val="single" w:sz="4" w:color="D9D9D9"/>
-              <w:left w:val="single" w:sz="4" w:color="D9D9D9"/>
-              <w:right w:val="single" w:sz="4" w:color="D9D9D9"/>
-            </w:tcBorders>
-            <w:tcMar>
-              <w:top w:w="70" w:type="dxa"/>
-              <w:bottom w:w="70" w:type="dxa"/>
-              <w:left w:w="70" w:type="dxa"/>
-              <w:right w:w="70" w:type="dxa"/>
-            </w:tcMar>
-          </w:tcPr>
-          <w:p>
-            <w:pPr>
-              <w:keepNext/>
-              <w:spacing w:line="259" w:lineRule="auto" w:after="80" w:before="80"/>
-              <w:ind w:firstLine="0"/>
-              <w:jc w:val="center"/>
-            </w:pPr>
-            <w:r>
-              <w:rPr>
-                <w:rFonts w:ascii="Times New Roman" w:hAnsi="Times New Roman" w:eastAsia="宋体"/>
-                <w:b w:val="0"/>
-                <w:color w:val="000000"/>
-                <w:sz w:val="19"/>
-              </w:rPr>
-              <w:t>SlotSPE</w:t>
-            </w:r>
-          </w:p>
-        </w:tc>
-        <w:tc>
-          <w:tcPr>
-            <w:tcW w:type="dxa" w:w="1871"/>
-            <w:vAlign w:val="center"/>
-            <w:tcBorders>
-              <w:top w:val="single" w:sz="4" w:color="D9D9D9"/>
-              <w:bottom w:val="single" w:sz="4" w:color="D9D9D9"/>
-              <w:left w:val="single" w:sz="4" w:color="D9D9D9"/>
-              <w:right w:val="single" w:sz="4" w:color="D9D9D9"/>
-            </w:tcBorders>
-            <w:tcMar>
-              <w:top w:w="70" w:type="dxa"/>
-              <w:bottom w:w="70" w:type="dxa"/>
-              <w:left w:w="70" w:type="dxa"/>
-              <w:right w:w="70" w:type="dxa"/>
-            </w:tcMar>
-          </w:tcPr>
-          <w:p>
-            <w:pPr>
-              <w:keepNext/>
-              <w:spacing w:line="259" w:lineRule="auto" w:after="80" w:before="80"/>
-              <w:ind w:firstLine="0"/>
-              <w:jc w:val="center"/>
-            </w:pPr>
-            <w:r>
-              <w:rPr>
-                <w:rFonts w:ascii="Times New Roman" w:hAnsi="Times New Roman" w:eastAsia="宋体"/>
-                <w:b w:val="0"/>
-                <w:color w:val="000000"/>
-                <w:sz w:val="19"/>
-              </w:rPr>
-              <w:t>native</w:t>
-            </w:r>
-          </w:p>
-        </w:tc>
-        <w:tc>
-          <w:tcPr>
-            <w:tcW w:type="dxa" w:w="2835"/>
-            <w:vAlign w:val="center"/>
-            <w:tcBorders>
-              <w:top w:val="single" w:sz="4" w:color="D9D9D9"/>
-              <w:bottom w:val="single" w:sz="4" w:color="D9D9D9"/>
-              <w:left w:val="single" w:sz="4" w:color="D9D9D9"/>
-              <w:right w:val="single" w:sz="4" w:color="D9D9D9"/>
-            </w:tcBorders>
-            <w:tcMar>
-              <w:top w:w="70" w:type="dxa"/>
-              <w:bottom w:w="70" w:type="dxa"/>
-              <w:left w:w="70" w:type="dxa"/>
-              <w:right w:w="70" w:type="dxa"/>
-            </w:tcMar>
-          </w:tcPr>
-          <w:p>
-            <w:pPr>
-              <w:keepNext/>
-              <w:spacing w:line="259" w:lineRule="auto" w:after="80" w:before="80"/>
-              <w:ind w:firstLine="0"/>
-              <w:jc w:val="center"/>
-            </w:pPr>
-            <w:r>
-              <w:rPr>
-                <w:rFonts w:ascii="Times New Roman" w:hAnsi="Times New Roman" w:eastAsia="宋体"/>
-                <w:b w:val="0"/>
-                <w:color w:val="000000"/>
-                <w:sz w:val="19"/>
-              </w:rPr>
-              <w:t>待补齐逐折记录</w:t>
-            </w:r>
-          </w:p>
-        </w:tc>
-        <w:tc>
-          <w:tcPr>
-            <w:tcW w:type="dxa" w:w="2835"/>
-            <w:vAlign w:val="center"/>
-            <w:tcBorders>
-              <w:top w:val="single" w:sz="4" w:color="D9D9D9"/>
-              <w:bottom w:val="single" w:sz="4" w:color="D9D9D9"/>
-              <w:left w:val="single" w:sz="4" w:color="D9D9D9"/>
-              <w:right w:val="single" w:sz="4" w:color="D9D9D9"/>
-            </w:tcBorders>
-            <w:tcMar>
-              <w:top w:w="70" w:type="dxa"/>
-              <w:bottom w:w="70" w:type="dxa"/>
-              <w:left w:w="70" w:type="dxa"/>
-              <w:right w:w="70" w:type="dxa"/>
-            </w:tcMar>
-          </w:tcPr>
-          <w:p>
-            <w:pPr>
-              <w:keepNext/>
-              <w:spacing w:line="259" w:lineRule="auto" w:after="80" w:before="80"/>
-              <w:ind w:firstLine="0"/>
-              <w:jc w:val="center"/>
-            </w:pPr>
-            <w:r>
-              <w:rPr>
-                <w:rFonts w:ascii="Times New Roman" w:hAnsi="Times New Roman" w:eastAsia="宋体"/>
-                <w:b w:val="0"/>
-                <w:color w:val="000000"/>
-                <w:sz w:val="19"/>
-              </w:rPr>
-              <w:t>待补齐逐折记录</w:t>
-            </w:r>
-          </w:p>
-        </w:tc>
-      </w:tr>
-    </w:tbl>
+      </w:pPr>
+      <w:r>
+        <w:drawing>
+          <wp:inline xmlns:a="http://schemas.openxmlformats.org/drawingml/2006/main" xmlns:pic="http://schemas.openxmlformats.org/drawingml/2006/picture">
+            <wp:extent cx="5940000" cy="3417015"/>
+            <wp:docPr id="2" name="Picture 2" descr="十癌种公开报告值与 DCT v3.13 的完整参考比较"/>
+            <wp:cNvGraphicFramePr>
+              <a:graphicFrameLocks noChangeAspect="1"/>
+            </wp:cNvGraphicFramePr>
+            <a:graphic>
+              <a:graphicData uri="http://schemas.openxmlformats.org/drawingml/2006/picture">
+                <pic:pic>
+                  <pic:nvPicPr>
+                    <pic:cNvPr id="0" name="table_v313_ten_cancer_comparison.png"/>
+                    <pic:cNvPicPr/>
+                  </pic:nvPicPr>
+                  <pic:blipFill>
+                    <a:blip r:embed="rId11"/>
+                    <a:stretch>
+                      <a:fillRect/>
+                    </a:stretch>
+                  </pic:blipFill>
+                  <pic:spPr>
+                    <a:xfrm>
+                      <a:off x="0" y="0"/>
+                      <a:ext cx="5940000" cy="3417015"/>
+                    </a:xfrm>
+                    <a:prstGeom prst="rect"/>
+                  </pic:spPr>
+                </pic:pic>
+              </a:graphicData>
+            </a:graphic>
+          </wp:inline>
+        </w:drawing>
+      </w:r>
+    </w:p>
     <w:p>
       <w:pPr>
         <w:keepLines/>
@@ -9337,7 +8779,7 @@
           <w:color w:val="000000"/>
           <w:sz w:val="18"/>
         </w:rPr>
-        <w:t>表 2 外部基线比较位置。SlotSPE 数值仅在其完整五折最佳预测、训练配方与评分口径核验后填入；当前不以约数或已发表的不同编码器分数代替本地实验。</w:t>
+        <w:t>表 2 十个 TCGA 队列的公开报告值参考比较，共 19 个模型。每列第一名红色加粗，第二名加下划线，DCT 行淡黄色高亮；按三位小数的显示值计算排名，并列共享名次，第二个不同分数为第二名。原论文使用 UNI，本文使用 UNI2-h，患者划分未对齐，因此这些名次是报告值参考排名。基线 Overall 保留原论文值；DCT Overall 按十个未四舍五入癌种均值等权计算。原论文样本人数不作为本文各队列的人数。</w:t>
       </w:r>
     </w:p>
     <w:p>
@@ -9351,7 +8793,21 @@
           <w:color w:val="000000"/>
           <w:sz w:val="21"/>
         </w:rPr>
-        <w:t>目前材料表明 Stage B 的 native/matched 结果已运行，作者提供的溯源说明也已确认外部比较表；本地正文材料尚缺四组完整逐折值及实际配置对应。本文先保留表位，不据未填入的表格主张超过 SlotSPE。其他已发表方法的分数只有在输入与评价条件一致时才加入同一主表。</w:t>
+        <w:t>在该报告值参考表中，DCT 在 KIRC（0.822）、LUAD（0.686）和 BLCA（0.724）列排名第一，在 LUSC（0.630）和 HNSC（0.658）列排名第二；Overall 为 0.703，位于 SlotSPE 的 0.721 之后，排名第二。这说明当前完整模型的报告值在部分队列具有竞争力，同时整体均值仍低于 SlotSPE 的已发表值。</w:t>
+      </w:r>
+    </w:p>
+    <w:p>
+      <w:pPr>
+        <w:jc w:val="both"/>
+      </w:pPr>
+      <w:r>
+        <w:rPr>
+          <w:rFonts w:ascii="Times New Roman" w:hAnsi="Times New Roman" w:eastAsia="宋体"/>
+          <w:b w:val="0"/>
+          <w:color w:val="000000"/>
+          <w:sz w:val="21"/>
+        </w:rPr>
+        <w:t>该表比较公开报告值与作者保存的模型开发结果，编码器和患者划分差异限制了直接归因。用于检验方法增益的同条件 SlotSPE native/matched 实验需另行核对实际配置、五折评分与最佳预测，不能将公开均值转换成虚构逐折数组。论文后续消融与运输对照均依据本研究已有记录分析模块收益。</w:t>
       </w:r>
     </w:p>
     <w:p>
@@ -9643,7 +9099,7 @@
           </w:tcPr>
           <w:p>
             <w:pPr>
-              <w:keepNext w:val="0"/>
+              <w:keepNext/>
               <w:spacing w:line="259" w:lineRule="auto" w:after="80" w:before="80"/>
               <w:ind w:firstLine="0"/>
               <w:jc w:val="center"/>
@@ -9678,7 +9134,7 @@
           </w:tcPr>
           <w:p>
             <w:pPr>
-              <w:keepNext w:val="0"/>
+              <w:keepNext/>
               <w:spacing w:line="259" w:lineRule="auto" w:after="80" w:before="80"/>
               <w:ind w:firstLine="0"/>
               <w:jc w:val="center"/>
@@ -9713,7 +9169,7 @@
           </w:tcPr>
           <w:p>
             <w:pPr>
-              <w:keepNext w:val="0"/>
+              <w:keepNext/>
               <w:spacing w:line="259" w:lineRule="auto" w:after="80" w:before="80"/>
               <w:ind w:firstLine="0"/>
               <w:jc w:val="center"/>
@@ -9748,7 +9204,7 @@
           </w:tcPr>
           <w:p>
             <w:pPr>
-              <w:keepNext w:val="0"/>
+              <w:keepNext/>
               <w:spacing w:line="259" w:lineRule="auto" w:after="80" w:before="80"/>
               <w:ind w:firstLine="0"/>
               <w:jc w:val="center"/>
@@ -9783,7 +9239,7 @@
           </w:tcPr>
           <w:p>
             <w:pPr>
-              <w:keepNext w:val="0"/>
+              <w:keepNext/>
               <w:spacing w:line="259" w:lineRule="auto" w:after="80" w:before="80"/>
               <w:ind w:firstLine="0"/>
               <w:jc w:val="center"/>
@@ -9818,7 +9274,7 @@
           </w:tcPr>
           <w:p>
             <w:pPr>
-              <w:keepNext w:val="0"/>
+              <w:keepNext/>
               <w:spacing w:line="259" w:lineRule="auto" w:after="80" w:before="80"/>
               <w:ind w:firstLine="0"/>
               <w:jc w:val="center"/>
@@ -9858,7 +9314,7 @@
           </w:tcPr>
           <w:p>
             <w:pPr>
-              <w:keepNext w:val="0"/>
+              <w:keepNext/>
               <w:spacing w:line="259" w:lineRule="auto" w:after="80" w:before="80"/>
               <w:ind w:firstLine="0"/>
               <w:jc w:val="center"/>
@@ -9893,7 +9349,7 @@
           </w:tcPr>
           <w:p>
             <w:pPr>
-              <w:keepNext w:val="0"/>
+              <w:keepNext/>
               <w:spacing w:line="259" w:lineRule="auto" w:after="80" w:before="80"/>
               <w:ind w:firstLine="0"/>
               <w:jc w:val="center"/>
@@ -9928,7 +9384,7 @@
           </w:tcPr>
           <w:p>
             <w:pPr>
-              <w:keepNext w:val="0"/>
+              <w:keepNext/>
               <w:spacing w:line="259" w:lineRule="auto" w:after="80" w:before="80"/>
               <w:ind w:firstLine="0"/>
               <w:jc w:val="center"/>
@@ -9963,7 +9419,7 @@
           </w:tcPr>
           <w:p>
             <w:pPr>
-              <w:keepNext w:val="0"/>
+              <w:keepNext/>
               <w:spacing w:line="259" w:lineRule="auto" w:after="80" w:before="80"/>
               <w:ind w:firstLine="0"/>
               <w:jc w:val="center"/>
@@ -9998,7 +9454,7 @@
           </w:tcPr>
           <w:p>
             <w:pPr>
-              <w:keepNext w:val="0"/>
+              <w:keepNext/>
               <w:spacing w:line="259" w:lineRule="auto" w:after="80" w:before="80"/>
               <w:ind w:firstLine="0"/>
               <w:jc w:val="center"/>
@@ -10033,7 +9489,7 @@
           </w:tcPr>
           <w:p>
             <w:pPr>
-              <w:keepNext w:val="0"/>
+              <w:keepNext/>
               <w:spacing w:line="259" w:lineRule="auto" w:after="80" w:before="80"/>
               <w:ind w:firstLine="0"/>
               <w:jc w:val="center"/>
@@ -10073,7 +9529,7 @@
           </w:tcPr>
           <w:p>
             <w:pPr>
-              <w:keepNext w:val="0"/>
+              <w:keepNext/>
               <w:spacing w:line="259" w:lineRule="auto" w:after="80" w:before="80"/>
               <w:ind w:firstLine="0"/>
               <w:jc w:val="center"/>
@@ -10108,7 +9564,7 @@
           </w:tcPr>
           <w:p>
             <w:pPr>
-              <w:keepNext w:val="0"/>
+              <w:keepNext/>
               <w:spacing w:line="259" w:lineRule="auto" w:after="80" w:before="80"/>
               <w:ind w:firstLine="0"/>
               <w:jc w:val="center"/>
@@ -10143,7 +9599,7 @@
           </w:tcPr>
           <w:p>
             <w:pPr>
-              <w:keepNext w:val="0"/>
+              <w:keepNext/>
               <w:spacing w:line="259" w:lineRule="auto" w:after="80" w:before="80"/>
               <w:ind w:firstLine="0"/>
               <w:jc w:val="center"/>
@@ -10178,7 +9634,7 @@
           </w:tcPr>
           <w:p>
             <w:pPr>
-              <w:keepNext w:val="0"/>
+              <w:keepNext/>
               <w:spacing w:line="259" w:lineRule="auto" w:after="80" w:before="80"/>
               <w:ind w:firstLine="0"/>
               <w:jc w:val="center"/>
@@ -10213,7 +9669,7 @@
           </w:tcPr>
           <w:p>
             <w:pPr>
-              <w:keepNext w:val="0"/>
+              <w:keepNext/>
               <w:spacing w:line="259" w:lineRule="auto" w:after="80" w:before="80"/>
               <w:ind w:firstLine="0"/>
               <w:jc w:val="center"/>
@@ -10248,7 +9704,7 @@
           </w:tcPr>
           <w:p>
             <w:pPr>
-              <w:keepNext w:val="0"/>
+              <w:keepNext/>
               <w:spacing w:line="259" w:lineRule="auto" w:after="80" w:before="80"/>
               <w:ind w:firstLine="0"/>
               <w:jc w:val="center"/>
@@ -10288,7 +9744,7 @@
           </w:tcPr>
           <w:p>
             <w:pPr>
-              <w:keepNext w:val="0"/>
+              <w:keepNext/>
               <w:spacing w:line="259" w:lineRule="auto" w:after="80" w:before="80"/>
               <w:ind w:firstLine="0"/>
               <w:jc w:val="center"/>
@@ -10323,7 +9779,7 @@
           </w:tcPr>
           <w:p>
             <w:pPr>
-              <w:keepNext w:val="0"/>
+              <w:keepNext/>
               <w:spacing w:line="259" w:lineRule="auto" w:after="80" w:before="80"/>
               <w:ind w:firstLine="0"/>
               <w:jc w:val="center"/>
@@ -10358,7 +9814,7 @@
           </w:tcPr>
           <w:p>
             <w:pPr>
-              <w:keepNext w:val="0"/>
+              <w:keepNext/>
               <w:spacing w:line="259" w:lineRule="auto" w:after="80" w:before="80"/>
               <w:ind w:firstLine="0"/>
               <w:jc w:val="center"/>
@@ -10393,7 +9849,7 @@
           </w:tcPr>
           <w:p>
             <w:pPr>
-              <w:keepNext w:val="0"/>
+              <w:keepNext/>
               <w:spacing w:line="259" w:lineRule="auto" w:after="80" w:before="80"/>
               <w:ind w:firstLine="0"/>
               <w:jc w:val="center"/>
@@ -10428,7 +9884,7 @@
           </w:tcPr>
           <w:p>
             <w:pPr>
-              <w:keepNext w:val="0"/>
+              <w:keepNext/>
               <w:spacing w:line="259" w:lineRule="auto" w:after="80" w:before="80"/>
               <w:ind w:firstLine="0"/>
               <w:jc w:val="center"/>
@@ -10463,7 +9919,7 @@
           </w:tcPr>
           <w:p>
             <w:pPr>
-              <w:keepNext w:val="0"/>
+              <w:keepNext/>
               <w:spacing w:line="259" w:lineRule="auto" w:after="80" w:before="80"/>
               <w:ind w:firstLine="0"/>
               <w:jc w:val="center"/>
@@ -10503,7 +9959,7 @@
           </w:tcPr>
           <w:p>
             <w:pPr>
-              <w:keepNext w:val="0"/>
+              <w:keepNext/>
               <w:spacing w:line="259" w:lineRule="auto" w:after="80" w:before="80"/>
               <w:ind w:firstLine="0"/>
               <w:jc w:val="center"/>
@@ -10538,7 +9994,7 @@
           </w:tcPr>
           <w:p>
             <w:pPr>
-              <w:keepNext w:val="0"/>
+              <w:keepNext/>
               <w:spacing w:line="259" w:lineRule="auto" w:after="80" w:before="80"/>
               <w:ind w:firstLine="0"/>
               <w:jc w:val="center"/>
@@ -10573,7 +10029,7 @@
           </w:tcPr>
           <w:p>
             <w:pPr>
-              <w:keepNext w:val="0"/>
+              <w:keepNext/>
               <w:spacing w:line="259" w:lineRule="auto" w:after="80" w:before="80"/>
               <w:ind w:firstLine="0"/>
               <w:jc w:val="center"/>
@@ -10608,7 +10064,7 @@
           </w:tcPr>
           <w:p>
             <w:pPr>
-              <w:keepNext w:val="0"/>
+              <w:keepNext/>
               <w:spacing w:line="259" w:lineRule="auto" w:after="80" w:before="80"/>
               <w:ind w:firstLine="0"/>
               <w:jc w:val="center"/>
@@ -10643,7 +10099,7 @@
           </w:tcPr>
           <w:p>
             <w:pPr>
-              <w:keepNext w:val="0"/>
+              <w:keepNext/>
               <w:spacing w:line="259" w:lineRule="auto" w:after="80" w:before="80"/>
               <w:ind w:firstLine="0"/>
               <w:jc w:val="center"/>
@@ -10678,7 +10134,7 @@
           </w:tcPr>
           <w:p>
             <w:pPr>
-              <w:keepNext w:val="0"/>
+              <w:keepNext/>
               <w:spacing w:line="259" w:lineRule="auto" w:after="80" w:before="80"/>
               <w:ind w:firstLine="0"/>
               <w:jc w:val="center"/>
@@ -10718,7 +10174,7 @@
           </w:tcPr>
           <w:p>
             <w:pPr>
-              <w:keepNext w:val="0"/>
+              <w:keepNext/>
               <w:spacing w:line="259" w:lineRule="auto" w:after="80" w:before="80"/>
               <w:ind w:firstLine="0"/>
               <w:jc w:val="center"/>
@@ -10753,7 +10209,7 @@
           </w:tcPr>
           <w:p>
             <w:pPr>
-              <w:keepNext w:val="0"/>
+              <w:keepNext/>
               <w:spacing w:line="259" w:lineRule="auto" w:after="80" w:before="80"/>
               <w:ind w:firstLine="0"/>
               <w:jc w:val="center"/>
@@ -10788,7 +10244,7 @@
           </w:tcPr>
           <w:p>
             <w:pPr>
-              <w:keepNext w:val="0"/>
+              <w:keepNext/>
               <w:spacing w:line="259" w:lineRule="auto" w:after="80" w:before="80"/>
               <w:ind w:firstLine="0"/>
               <w:jc w:val="center"/>
@@ -10823,7 +10279,7 @@
           </w:tcPr>
           <w:p>
             <w:pPr>
-              <w:keepNext w:val="0"/>
+              <w:keepNext/>
               <w:spacing w:line="259" w:lineRule="auto" w:after="80" w:before="80"/>
               <w:ind w:firstLine="0"/>
               <w:jc w:val="center"/>
@@ -10858,7 +10314,7 @@
           </w:tcPr>
           <w:p>
             <w:pPr>
-              <w:keepNext w:val="0"/>
+              <w:keepNext/>
               <w:spacing w:line="259" w:lineRule="auto" w:after="80" w:before="80"/>
               <w:ind w:firstLine="0"/>
               <w:jc w:val="center"/>
@@ -10893,7 +10349,7 @@
           </w:tcPr>
           <w:p>
             <w:pPr>
-              <w:keepNext w:val="0"/>
+              <w:keepNext/>
               <w:spacing w:line="259" w:lineRule="auto" w:after="80" w:before="80"/>
               <w:ind w:firstLine="0"/>
               <w:jc w:val="center"/>
@@ -12671,7 +12127,7 @@
         <w:drawing>
           <wp:inline xmlns:a="http://schemas.openxmlformats.org/drawingml/2006/main" xmlns:pic="http://schemas.openxmlformats.org/drawingml/2006/picture">
             <wp:extent cx="5940000" cy="3355000"/>
-            <wp:docPr id="2" name="Picture 2" descr="七组损失配置的逐折分布、五折均值与样本标准差"/>
+            <wp:docPr id="3" name="Picture 3" descr="七组损失配置的逐折分布、五折均值与样本标准差"/>
             <wp:cNvGraphicFramePr>
               <a:graphicFrameLocks noChangeAspect="1"/>
             </wp:cNvGraphicFramePr>
@@ -12683,7 +12139,7 @@
                     <pic:cNvPicPr/>
                   </pic:nvPicPr>
                   <pic:blipFill>
-                    <a:blip r:embed="rId11"/>
+                    <a:blip r:embed="rId12"/>
                     <a:stretch>
                       <a:fillRect/>
                     </a:stretch>
@@ -13584,7 +13040,7 @@
         <w:drawing>
           <wp:inline xmlns:a="http://schemas.openxmlformats.org/drawingml/2006/main" xmlns:pic="http://schemas.openxmlformats.org/drawingml/2006/picture">
             <wp:extent cx="5940000" cy="5170000"/>
-            <wp:docPr id="3" name="Picture 3" descr="Full 与重训控制臂的逐折 C-index 及差值"/>
+            <wp:docPr id="4" name="Picture 4" descr="Full 与重训控制臂的逐折 C-index 及差值"/>
             <wp:cNvGraphicFramePr>
               <a:graphicFrameLocks noChangeAspect="1"/>
             </wp:cNvGraphicFramePr>
@@ -13596,7 +13052,7 @@
                     <pic:cNvPicPr/>
                   </pic:nvPicPr>
                   <pic:blipFill>
-                    <a:blip r:embed="rId12"/>
+                    <a:blip r:embed="rId13"/>
                     <a:stretch>
                       <a:fillRect/>
                     </a:stretch>
@@ -14100,7 +13556,7 @@
         <w:drawing>
           <wp:inline xmlns:a="http://schemas.openxmlformats.org/drawingml/2006/main" xmlns:pic="http://schemas.openxmlformats.org/drawingml/2006/picture">
             <wp:extent cx="5940000" cy="2443434"/>
-            <wp:docPr id="4" name="Picture 4" descr="固定 Full 模型的运输计划替换，BLCA 和 KIRC 各五折"/>
+            <wp:docPr id="5" name="Picture 5" descr="固定 Full 模型的运输计划替换，BLCA 和 KIRC 各五折"/>
             <wp:cNvGraphicFramePr>
               <a:graphicFrameLocks noChangeAspect="1"/>
             </wp:cNvGraphicFramePr>
@@ -14112,7 +13568,7 @@
                     <pic:cNvPicPr/>
                   </pic:nvPicPr>
                   <pic:blipFill>
-                    <a:blip r:embed="rId13"/>
+                    <a:blip r:embed="rId14"/>
                     <a:stretch>
                       <a:fillRect/>
                     </a:stretch>
@@ -14228,7 +13684,7 @@
         <w:drawing>
           <wp:inline xmlns:a="http://schemas.openxmlformats.org/drawingml/2006/main" xmlns:pic="http://schemas.openxmlformats.org/drawingml/2006/picture">
             <wp:extent cx="5940000" cy="5841000"/>
-            <wp:docPr id="5" name="Picture 5" descr="BLCA Full 五折总体高低风险生存曲线"/>
+            <wp:docPr id="6" name="Picture 6" descr="BLCA Full 五折总体高低风险生存曲线"/>
             <wp:cNvGraphicFramePr>
               <a:graphicFrameLocks noChangeAspect="1"/>
             </wp:cNvGraphicFramePr>
@@ -14240,7 +13696,7 @@
                     <pic:cNvPicPr/>
                   </pic:nvPicPr>
                   <pic:blipFill>
-                    <a:blip r:embed="rId14"/>
+                    <a:blip r:embed="rId15"/>
                     <a:stretch>
                       <a:fillRect/>
                     </a:stretch>
@@ -14285,7 +13741,7 @@
         <w:drawing>
           <wp:inline xmlns:a="http://schemas.openxmlformats.org/drawingml/2006/main" xmlns:pic="http://schemas.openxmlformats.org/drawingml/2006/picture">
             <wp:extent cx="5940000" cy="5841000"/>
-            <wp:docPr id="6" name="Picture 6" descr="KIRC Full 五折总体高低风险生存曲线"/>
+            <wp:docPr id="7" name="Picture 7" descr="KIRC Full 五折总体高低风险生存曲线"/>
             <wp:cNvGraphicFramePr>
               <a:graphicFrameLocks noChangeAspect="1"/>
             </wp:cNvGraphicFramePr>
@@ -14297,7 +13753,7 @@
                     <pic:cNvPicPr/>
                   </pic:nvPicPr>
                   <pic:blipFill>
-                    <a:blip r:embed="rId15"/>
+                    <a:blip r:embed="rId16"/>
                     <a:stretch>
                       <a:fillRect/>
                     </a:stretch>
@@ -14989,7 +14445,7 @@
         <w:drawing>
           <wp:inline xmlns:a="http://schemas.openxmlformats.org/drawingml/2006/main" xmlns:pic="http://schemas.openxmlformats.org/drawingml/2006/picture">
             <wp:extent cx="4873762" cy="6695999"/>
-            <wp:docPr id="7" name="Picture 7" descr="BLCA 病例 TCGA-2F-A9KP 的通路到组学槽注意力矩阵"/>
+            <wp:docPr id="8" name="Picture 8" descr="BLCA 病例 TCGA-2F-A9KP 的通路到组学槽注意力矩阵"/>
             <wp:cNvGraphicFramePr>
               <a:graphicFrameLocks noChangeAspect="1"/>
             </wp:cNvGraphicFramePr>
@@ -15001,7 +14457,7 @@
                     <pic:cNvPicPr/>
                   </pic:nvPicPr>
                   <pic:blipFill>
-                    <a:blip r:embed="rId16"/>
+                    <a:blip r:embed="rId17"/>
                     <a:stretch>
                       <a:fillRect/>
                     </a:stretch>
@@ -15046,7 +14502,7 @@
         <w:drawing>
           <wp:inline xmlns:a="http://schemas.openxmlformats.org/drawingml/2006/main" xmlns:pic="http://schemas.openxmlformats.org/drawingml/2006/picture">
             <wp:extent cx="5940000" cy="1762364"/>
-            <wp:docPr id="8" name="Picture 8" descr="BLCA 病例的学习运输计划、同边际独立计划与差值"/>
+            <wp:docPr id="9" name="Picture 9" descr="BLCA 病例的学习运输计划、同边际独立计划与差值"/>
             <wp:cNvGraphicFramePr>
               <a:graphicFrameLocks noChangeAspect="1"/>
             </wp:cNvGraphicFramePr>
@@ -15058,7 +14514,7 @@
                     <pic:cNvPicPr/>
                   </pic:nvPicPr>
                   <pic:blipFill>
-                    <a:blip r:embed="rId17"/>
+                    <a:blip r:embed="rId18"/>
                     <a:stretch>
                       <a:fillRect/>
                     </a:stretch>
@@ -15131,7 +14587,7 @@
         <w:drawing>
           <wp:inline xmlns:a="http://schemas.openxmlformats.org/drawingml/2006/main" xmlns:pic="http://schemas.openxmlformats.org/drawingml/2006/picture">
             <wp:extent cx="5846782" cy="7631999"/>
-            <wp:docPr id="9" name="Picture 9" descr="BLCA 队列通路注意力的绝对组间差值"/>
+            <wp:docPr id="10" name="Picture 10" descr="BLCA 队列通路注意力的绝对组间差值"/>
             <wp:cNvGraphicFramePr>
               <a:graphicFrameLocks noChangeAspect="1"/>
             </wp:cNvGraphicFramePr>
@@ -15143,7 +14599,7 @@
                     <pic:cNvPicPr/>
                   </pic:nvPicPr>
                   <pic:blipFill>
-                    <a:blip r:embed="rId18"/>
+                    <a:blip r:embed="rId19"/>
                     <a:stretch>
                       <a:fillRect/>
                     </a:stretch>
@@ -15188,7 +14644,7 @@
         <w:drawing>
           <wp:inline xmlns:a="http://schemas.openxmlformats.org/drawingml/2006/main" xmlns:pic="http://schemas.openxmlformats.org/drawingml/2006/picture">
             <wp:extent cx="5428165" cy="7632000"/>
-            <wp:docPr id="10" name="Picture 10" descr="KIRC 队列通路注意力的绝对组间差值"/>
+            <wp:docPr id="11" name="Picture 11" descr="KIRC 队列通路注意力的绝对组间差值"/>
             <wp:cNvGraphicFramePr>
               <a:graphicFrameLocks noChangeAspect="1"/>
             </wp:cNvGraphicFramePr>
@@ -15200,7 +14656,7 @@
                     <pic:cNvPicPr/>
                   </pic:nvPicPr>
                   <pic:blipFill>
-                    <a:blip r:embed="rId19"/>
+                    <a:blip r:embed="rId20"/>
                     <a:stretch>
                       <a:fillRect/>
                     </a:stretch>
@@ -15436,7 +14892,7 @@
         </w:rPr>
         <w:t xml:space="preserve">[1] Chen RJ, Lu MY, Weng WH, et al. Multimodal Co-Attention Transformer for Survival Prediction in Gigapixel Whole Slide Images. ICCV, 2021: 4015–4025. </w:t>
       </w:r>
-      <w:hyperlink r:id="rId20">
+      <w:hyperlink r:id="rId21">
         <w:r>
           <w:t>出版页面</w:t>
         </w:r>
@@ -15466,7 +14922,7 @@
         </w:rPr>
         <w:t xml:space="preserve">[2] Xu Y, Chen H. Multimodal Optimal Transport-based Co-Attention Transformer with Global Structure Consistency for Survival Prediction. ICCV, 2023. </w:t>
       </w:r>
-      <w:hyperlink r:id="rId21">
+      <w:hyperlink r:id="rId22">
         <w:r>
           <w:t>论文原文</w:t>
         </w:r>
@@ -15496,7 +14952,7 @@
         </w:rPr>
         <w:t xml:space="preserve">[3] Zhang Y, Li N, Yang C, Schmidhuber J, Gao X. Structural Prognostic Event Modeling for Multimodal Cancer Survival Analysis. ICLR, 2026; arXiv:2512.01116. </w:t>
       </w:r>
-      <w:hyperlink r:id="rId22">
+      <w:hyperlink r:id="rId23">
         <w:r>
           <w:t>作者论文</w:t>
         </w:r>
@@ -15526,7 +14982,7 @@
         </w:rPr>
         <w:t xml:space="preserve">[4] Locatello F, Weissenborn D, Unterthiner T, et al. Object-Centric Learning with Slot Attention. NeurIPS, 2020. </w:t>
       </w:r>
-      <w:hyperlink r:id="rId23">
+      <w:hyperlink r:id="rId24">
         <w:r>
           <w:t>出版页面</w:t>
         </w:r>
@@ -15556,7 +15012,7 @@
         </w:rPr>
         <w:t xml:space="preserve">[5] Cuturi M. Sinkhorn Distances: Lightspeed Computation of Optimal Transport. NeurIPS, 2013. </w:t>
       </w:r>
-      <w:hyperlink r:id="rId24">
+      <w:hyperlink r:id="rId25">
         <w:r>
           <w:t>出版页面</w:t>
         </w:r>
@@ -15586,7 +15042,7 @@
         </w:rPr>
         <w:t xml:space="preserve">[6] Gensheimer MF, Narasimhan B. A scalable discrete-time survival model for neural networks. PeerJ, 2019;7:e6257. </w:t>
       </w:r>
-      <w:hyperlink r:id="rId25">
+      <w:hyperlink r:id="rId26">
         <w:r>
           <w:t>论文原文</w:t>
         </w:r>
@@ -15616,7 +15072,7 @@
         </w:rPr>
         <w:t xml:space="preserve">[7] Uno H, Cai T, Pencina MJ, D’Agostino RB, Wei LJ. On the C-statistics for evaluating overall adequacy of risk prediction procedures with censored survival data. Statistics in Medicine, 2011;30:1105–1117. </w:t>
       </w:r>
-      <w:hyperlink r:id="rId26">
+      <w:hyperlink r:id="rId27">
         <w:r>
           <w:t>开放原文</w:t>
         </w:r>
@@ -15646,7 +15102,7 @@
         </w:rPr>
         <w:t xml:space="preserve">[8] Mahmood Lab. UNI and UNI2 official model repository. </w:t>
       </w:r>
-      <w:hyperlink r:id="rId27">
+      <w:hyperlink r:id="rId28">
         <w:r>
           <w:t>官方模型与版本说明</w:t>
         </w:r>
@@ -20419,7 +19875,7 @@
           <w:color w:val="000000"/>
           <w:sz w:val="21"/>
         </w:rPr>
-        <w:t>SlotSPE native/matched 表位保留；本地还需四组五折原值、最佳预测与配方信息。队列人数、事件/删失比例和设备信息仅在真实清单可核验时补入。十队列 Full 值本身不构成对其他方法的统一优越性证据。</w:t>
+        <w:t>表 2 已填入 SlotSPE 原论文 18 个方法的全部十队列报告值，并加入本文 DCT v3.13。原论文表 1 的 180 个癌种均值与附录表 4 全部交叉核对，18 个 Overall 保留原文；配套 JSON 保存 180 个标准差、来源 PDF SHA256 和 DCT 的真实 50 个折值。该表为公开报告值参考比较。SlotSPE 同条件 native/matched 的四组五折原值、最佳预测与配方信息仍需另行核对。队列人数、事件/删失比例和设备信息仅在真实清单可核验时补入。</w:t>
       </w:r>
     </w:p>
     <w:p>
@@ -21401,7 +20857,7 @@
         <w:drawing>
           <wp:inline xmlns:a="http://schemas.openxmlformats.org/drawingml/2006/main" xmlns:pic="http://schemas.openxmlformats.org/drawingml/2006/picture">
             <wp:extent cx="5846782" cy="7631999"/>
-            <wp:docPr id="11" name="Picture 11" descr="BLCA 队列通路的原始平均注意力"/>
+            <wp:docPr id="12" name="Picture 12" descr="BLCA 队列通路的原始平均注意力"/>
             <wp:cNvGraphicFramePr>
               <a:graphicFrameLocks noChangeAspect="1"/>
             </wp:cNvGraphicFramePr>
@@ -21413,7 +20869,7 @@
                     <pic:cNvPicPr/>
                   </pic:nvPicPr>
                   <pic:blipFill>
-                    <a:blip r:embed="rId28"/>
+                    <a:blip r:embed="rId29"/>
                     <a:stretch>
                       <a:fillRect/>
                     </a:stretch>
@@ -21458,7 +20914,7 @@
         <w:drawing>
           <wp:inline xmlns:a="http://schemas.openxmlformats.org/drawingml/2006/main" xmlns:pic="http://schemas.openxmlformats.org/drawingml/2006/picture">
             <wp:extent cx="5428165" cy="7632000"/>
-            <wp:docPr id="12" name="Picture 12" descr="KIRC 队列通路的原始平均注意力"/>
+            <wp:docPr id="13" name="Picture 13" descr="KIRC 队列通路的原始平均注意力"/>
             <wp:cNvGraphicFramePr>
               <a:graphicFrameLocks noChangeAspect="1"/>
             </wp:cNvGraphicFramePr>
@@ -21470,7 +20926,7 @@
                     <pic:cNvPicPr/>
                   </pic:nvPicPr>
                   <pic:blipFill>
-                    <a:blip r:embed="rId29"/>
+                    <a:blip r:embed="rId30"/>
                     <a:stretch>
                       <a:fillRect/>
                     </a:stretch>

</xml_diff>

<commit_message>
Replace v313 active comparison with OT and UNI2-h literature reference
</commit_message>
<xml_diff>
--- a/paper/DCT_v313_初稿.docx
+++ b/paper/DCT_v313_初稿.docx
@@ -350,6 +350,20 @@
     </w:p>
     <w:p>
       <w:pPr>
+        <w:jc w:val="both"/>
+      </w:pPr>
+      <w:r>
+        <w:rPr>
+          <w:rFonts w:ascii="Times New Roman" w:hAnsi="Times New Roman" w:eastAsia="宋体"/>
+          <w:b w:val="0"/>
+          <w:color w:val="000000"/>
+          <w:sz w:val="21"/>
+        </w:rPr>
+        <w:t>跨模态 OT 重建也已有相关研究。MCSP-OTMR 使用 OT 重建应对缺失组学，并引入 Fisher 引导的模态重加权 [13]；ME-Mamba 使用 OT 局部对齐与多专家融合 [14]。因此，本文将贡献定位于阶段条件运输、事件风险读取与复用预测运输计划的通路重建之间的具体联系，而不将 OT 对齐或 OT 重建本身作为独有机制。对 MCSP-OTMR 的定位目前依据出版社公开摘要，完整实现差异仍需全文核对。</w:t>
+      </w:r>
+    </w:p>
+    <w:p>
+      <w:pPr>
         <w:pStyle w:val="Heading1"/>
         <w:ind w:firstLine="0"/>
       </w:pPr>
@@ -8708,7 +8722,7 @@
           <w:color w:val="000000"/>
           <w:sz w:val="23"/>
         </w:rPr>
-        <w:t>4.3 外部基线比较</w:t>
+        <w:t>4.3 OT 与 UNI2-h 方法的公开结果参照</w:t>
       </w:r>
     </w:p>
     <w:p>
@@ -8722,7 +8736,7 @@
           <w:color w:val="000000"/>
           <w:sz w:val="21"/>
         </w:rPr>
-        <w:t>表 2 汇总 SlotSPE 原论文表 1 中 18 个方法的十队列报告值，并加入本文 DCT v3.13 的五折均值 [3]。基线数值从原论文 PDF 第 7 页直接提取，十队列均值另与第 22 页附录表 4 交叉核对，标准差保留在配套数值文件中。组学、病理和多模态方法均纳入逐列排名，没有只在多模态方法中选择最高值。</w:t>
+        <w:t>表 2 按研究问题选择 OT 生存预测方法，以及使用 UNI2-h 病理特征的生存预测方法 [9–11]。MOTCat 和 TTA 的数值来自 TTA 表 1；其中 MOTCat 是 TTA 作者使用 UNI、以 DSS 为终点的复现。OTSurv 来自原论文表 1，使用 UNI 和单病理输入。STEPH 与五种 MIL 参照来自其官方补充表 S2，使用 UNI2-h 和单病理输入。本文 DCT 行沿用表 1 的真实 50 个折值，均值不变。</w:t>
       </w:r>
     </w:p>
     <w:p>
@@ -8734,8 +8748,8 @@
       <w:r>
         <w:drawing>
           <wp:inline xmlns:a="http://schemas.openxmlformats.org/drawingml/2006/main" xmlns:pic="http://schemas.openxmlformats.org/drawingml/2006/picture">
-            <wp:extent cx="5940000" cy="3417015"/>
-            <wp:docPr id="2" name="Picture 2" descr="十癌种公开报告值与 DCT v3.13 的完整参考比较"/>
+            <wp:extent cx="5940000" cy="2308316"/>
+            <wp:docPr id="2" name="Picture 2" descr="DCT v3.13 与 OT 和 UNI2-h 生存预测方法的公开结果参照"/>
             <wp:cNvGraphicFramePr>
               <a:graphicFrameLocks noChangeAspect="1"/>
             </wp:cNvGraphicFramePr>
@@ -8743,7 +8757,7 @@
               <a:graphicData uri="http://schemas.openxmlformats.org/drawingml/2006/picture">
                 <pic:pic>
                   <pic:nvPicPr>
-                    <pic:cNvPr id="0" name="table_v313_ten_cancer_comparison.png"/>
+                    <pic:cNvPr id="0" name="table_v313_ot_uni2h_reference.png"/>
                     <pic:cNvPicPr/>
                   </pic:nvPicPr>
                   <pic:blipFill>
@@ -8755,7 +8769,7 @@
                   <pic:spPr>
                     <a:xfrm>
                       <a:off x="0" y="0"/>
-                      <a:ext cx="5940000" cy="3417015"/>
+                      <a:ext cx="5940000" cy="2308316"/>
                     </a:xfrm>
                     <a:prstGeom prst="rect"/>
                   </pic:spPr>
@@ -8779,7 +8793,7 @@
           <w:color w:val="000000"/>
           <w:sz w:val="18"/>
         </w:rPr>
-        <w:t>表 2 十个 TCGA 队列的公开报告值参考比较，共 19 个模型。每列第一名红色加粗，第二名加下划线，DCT 行淡黄色高亮；按三位小数的显示值计算排名，并列共享名次，第二个不同分数为第二名。原论文使用 UNI，本文使用 UNI2-h，患者划分未对齐，因此这些名次是报告值参考排名。基线 Overall 保留原论文值；DCT Overall 按十个未四舍五入癌种均值等权计算。原论文样本人数不作为本文各队列的人数。</w:t>
+        <w:t>表 2 十队列公开报告值参照。红色加粗为该列已有报告值中的最高值，下划线为第二个不同的显示值，DCT 行为淡黄色。U1 表示 UNI，U2 表示 UNI2-h；g. 与 h. 分别表示组学和病理。NR 表示论文未单独报告对应队列，不表示服务器汇总未完成。LUSC 没有可用的独立外部队列数值，故不排名。各论文的队列集合不同，不混排 Overall。</w:t>
       </w:r>
     </w:p>
     <w:p>
@@ -8793,7 +8807,7 @@
           <w:color w:val="000000"/>
           <w:sz w:val="21"/>
         </w:rPr>
-        <w:t>在该报告值参考表中，DCT 在 KIRC（0.822）、LUAD（0.686）和 BLCA（0.724）列排名第一，在 LUSC（0.630）和 HNSC（0.658）列排名第二；Overall 为 0.703，位于 SlotSPE 的 0.721 之后，排名第二。这说明当前完整模型的报告值在部分队列具有竞争力，同时整体均值仍低于 SlotSPE 的已发表值。</w:t>
+        <w:t>当前已汇总 49 个可按癌种名称对齐的公开均值。STEPH 的 KIPAN、LUNG、STES 为合并队列，不能分别替换 KIRC、LUAD/LUSC、STAD；TTA 与 OTSurv 的 CRC 在患者定义核对前不映射为 COADREAD。所有原始队列均值与来源离散度保留在配套数值文件中。</w:t>
       </w:r>
     </w:p>
     <w:p>
@@ -8807,7 +8821,21 @@
           <w:color w:val="000000"/>
           <w:sz w:val="21"/>
         </w:rPr>
-        <w:t>该表比较公开报告值与作者保存的模型开发结果，编码器和患者划分差异限制了直接归因。用于检验方法增益的同条件 SlotSPE native/matched 实验需另行核对实际配置、五折评分与最佳预测，不能将公开均值转换成虚构逐折数组。论文后续消融与运输对照均依据本研究已有记录分析模块收益。</w:t>
+        <w:t>该表显示当前报告值在部分队列具有竞争力，但输入模态、患者纳入、划分与 checkpoint 选择仍不同。DCT 目前采用 best-validation / legacy_val 开发汇总，列内名次不能解释为相同独立测试条件下的优劣。尤其 UNI2-h 病理单模态参照与 DCT 的病理、组学双模态输入不同；相同编码器本身并不建立公平比较。</w:t>
+      </w:r>
+    </w:p>
+    <w:p>
+      <w:pPr>
+        <w:jc w:val="both"/>
+      </w:pPr>
+      <w:r>
+        <w:rPr>
+          <w:rFonts w:ascii="Times New Roman" w:hAnsi="Times New Roman" w:eastAsia="宋体"/>
+          <w:b w:val="0"/>
+          <w:color w:val="000000"/>
+          <w:sz w:val="21"/>
+        </w:rPr>
+        <w:t>ProtoPathway 同样使用 UNI2-h，但以 OS 为终点 [12]，故作为结构相近的方法讨论并单独保存其公开值，不纳入本表的 DSS 排名。后续同条件参照优先覆盖 MOTCat、TTA、OTSurv 和 STEPH；模型收益与运输机制仍须结合本研究消融和对照判断。</w:t>
       </w:r>
     </w:p>
     <w:p>
@@ -15119,6 +15147,214 @@
     </w:p>
     <w:p>
       <w:pPr>
+        <w:keepLines/>
+        <w:ind w:hanging="283" w:left="283"/>
+        <w:jc w:val="left"/>
+      </w:pPr>
+      <w:r>
+        <w:rPr>
+          <w:rFonts w:ascii="Times New Roman" w:hAnsi="Times New Roman" w:eastAsia="宋体"/>
+          <w:b w:val="0"/>
+          <w:color w:val="000000"/>
+          <w:sz w:val="19"/>
+        </w:rPr>
+        <w:t xml:space="preserve">[9] Liu W, et al. Together, Then Apart: Balancing Alignment and Distinctiveness for Multimodal Survival Analysis. arXiv:2511.18089. </w:t>
+      </w:r>
+      <w:hyperlink r:id="rId29">
+        <w:r>
+          <w:t>原文</w:t>
+        </w:r>
+      </w:hyperlink>
+      <w:r>
+        <w:rPr>
+          <w:rFonts w:ascii="Times New Roman" w:hAnsi="Times New Roman" w:eastAsia="宋体"/>
+          <w:b w:val="0"/>
+          <w:color w:val="000000"/>
+          <w:sz w:val="19"/>
+        </w:rPr>
+        <w:t>.</w:t>
+      </w:r>
+    </w:p>
+    <w:p>
+      <w:pPr>
+        <w:keepLines/>
+        <w:ind w:hanging="283" w:left="283"/>
+        <w:jc w:val="left"/>
+      </w:pPr>
+      <w:r>
+        <w:rPr>
+          <w:rFonts w:ascii="Times New Roman" w:hAnsi="Times New Roman" w:eastAsia="宋体"/>
+          <w:b w:val="0"/>
+          <w:color w:val="000000"/>
+          <w:sz w:val="19"/>
+        </w:rPr>
+        <w:t xml:space="preserve">[10] Ren Q, et al. OTSurv: A Novel Multiple Instance Learning Framework for Survival Prediction with Heterogeneity-aware Optimal Transport. MICCAI, 2025. </w:t>
+      </w:r>
+      <w:hyperlink r:id="rId30">
+        <w:r>
+          <w:t>原文</w:t>
+        </w:r>
+      </w:hyperlink>
+      <w:r>
+        <w:rPr>
+          <w:rFonts w:ascii="Times New Roman" w:hAnsi="Times New Roman" w:eastAsia="宋体"/>
+          <w:b w:val="0"/>
+          <w:color w:val="000000"/>
+          <w:sz w:val="19"/>
+        </w:rPr>
+        <w:t>.</w:t>
+      </w:r>
+    </w:p>
+    <w:p>
+      <w:pPr>
+        <w:keepLines/>
+        <w:ind w:hanging="283" w:left="283"/>
+        <w:jc w:val="left"/>
+      </w:pPr>
+      <w:r>
+        <w:rPr>
+          <w:rFonts w:ascii="Times New Roman" w:hAnsi="Times New Roman" w:eastAsia="宋体"/>
+          <w:b w:val="0"/>
+          <w:color w:val="000000"/>
+          <w:sz w:val="19"/>
+        </w:rPr>
+        <w:t xml:space="preserve">[11] Liu P, et al. Sparse Task Vector Mixup with Hypernetworks for Efficient Knowledge Transfer in Whole-Slide Image Prognosis. CVPR, 2026. </w:t>
+      </w:r>
+      <w:hyperlink r:id="rId31">
+        <w:r>
+          <w:t>原文</w:t>
+        </w:r>
+      </w:hyperlink>
+      <w:r>
+        <w:rPr>
+          <w:rFonts w:ascii="Times New Roman" w:hAnsi="Times New Roman" w:eastAsia="宋体"/>
+          <w:b w:val="0"/>
+          <w:color w:val="000000"/>
+          <w:sz w:val="19"/>
+        </w:rPr>
+        <w:t>，</w:t>
+      </w:r>
+      <w:hyperlink r:id="rId32">
+        <w:r>
+          <w:t>补充材料</w:t>
+        </w:r>
+      </w:hyperlink>
+      <w:r>
+        <w:rPr>
+          <w:rFonts w:ascii="Times New Roman" w:hAnsi="Times New Roman" w:eastAsia="宋体"/>
+          <w:b w:val="0"/>
+          <w:color w:val="000000"/>
+          <w:sz w:val="19"/>
+        </w:rPr>
+        <w:t>.</w:t>
+      </w:r>
+    </w:p>
+    <w:p>
+      <w:pPr>
+        <w:keepLines/>
+        <w:ind w:hanging="283" w:left="283"/>
+        <w:jc w:val="left"/>
+      </w:pPr>
+      <w:r>
+        <w:rPr>
+          <w:rFonts w:ascii="Times New Roman" w:hAnsi="Times New Roman" w:eastAsia="宋体"/>
+          <w:b w:val="0"/>
+          <w:color w:val="000000"/>
+          <w:sz w:val="19"/>
+        </w:rPr>
+        <w:t xml:space="preserve">[12] ProtoPathway: Biologically Structured Prototype-Pathway Fusion for Multimodal Cancer Survival Prediction. arXiv:2605.21454, 2026. </w:t>
+      </w:r>
+      <w:hyperlink r:id="rId33">
+        <w:r>
+          <w:t>原文</w:t>
+        </w:r>
+      </w:hyperlink>
+      <w:r>
+        <w:rPr>
+          <w:rFonts w:ascii="Times New Roman" w:hAnsi="Times New Roman" w:eastAsia="宋体"/>
+          <w:b w:val="0"/>
+          <w:color w:val="000000"/>
+          <w:sz w:val="19"/>
+        </w:rPr>
+        <w:t>，</w:t>
+      </w:r>
+      <w:hyperlink r:id="rId34">
+        <w:r>
+          <w:t>作者代码与 UNI2-h 特征说明</w:t>
+        </w:r>
+      </w:hyperlink>
+      <w:r>
+        <w:rPr>
+          <w:rFonts w:ascii="Times New Roman" w:hAnsi="Times New Roman" w:eastAsia="宋体"/>
+          <w:b w:val="0"/>
+          <w:color w:val="000000"/>
+          <w:sz w:val="19"/>
+        </w:rPr>
+        <w:t>.</w:t>
+      </w:r>
+    </w:p>
+    <w:p>
+      <w:pPr>
+        <w:keepLines/>
+        <w:ind w:hanging="283" w:left="283"/>
+        <w:jc w:val="left"/>
+      </w:pPr>
+      <w:r>
+        <w:rPr>
+          <w:rFonts w:ascii="Times New Roman" w:hAnsi="Times New Roman" w:eastAsia="宋体"/>
+          <w:b w:val="0"/>
+          <w:color w:val="000000"/>
+          <w:sz w:val="19"/>
+        </w:rPr>
+        <w:t xml:space="preserve">[13] Feng L, Xiao L. Multimodal cancer survival prediction with optimal transport reconstruction and fisher-guided modal reweighting. Expert Systems with Applications, DOI:10.1016/j.eswa.2026.133823. </w:t>
+      </w:r>
+      <w:hyperlink r:id="rId35">
+        <w:r>
+          <w:t>出版社公开摘要</w:t>
+        </w:r>
+      </w:hyperlink>
+      <w:r>
+        <w:rPr>
+          <w:rFonts w:ascii="Times New Roman" w:hAnsi="Times New Roman" w:eastAsia="宋体"/>
+          <w:b w:val="0"/>
+          <w:color w:val="000000"/>
+          <w:sz w:val="19"/>
+        </w:rPr>
+        <w:t>.</w:t>
+      </w:r>
+    </w:p>
+    <w:p>
+      <w:pPr>
+        <w:keepLines/>
+        <w:ind w:hanging="283" w:left="283"/>
+        <w:jc w:val="left"/>
+      </w:pPr>
+      <w:r>
+        <w:rPr>
+          <w:rFonts w:ascii="Times New Roman" w:hAnsi="Times New Roman" w:eastAsia="宋体"/>
+          <w:b w:val="0"/>
+          <w:color w:val="000000"/>
+          <w:sz w:val="19"/>
+        </w:rPr>
+        <w:t xml:space="preserve">[14] ME-Mamba. arXiv:2509.16900. </w:t>
+      </w:r>
+      <w:hyperlink r:id="rId36">
+        <w:r>
+          <w:t>原文</w:t>
+        </w:r>
+      </w:hyperlink>
+      <w:r>
+        <w:rPr>
+          <w:rFonts w:ascii="Times New Roman" w:hAnsi="Times New Roman" w:eastAsia="宋体"/>
+          <w:b w:val="0"/>
+          <w:color w:val="000000"/>
+          <w:sz w:val="19"/>
+        </w:rPr>
+        <w:t>.</w:t>
+      </w:r>
+    </w:p>
+    <w:p>
+      <w:pPr>
         <w:pStyle w:val="Heading1"/>
         <w:ind w:firstLine="0"/>
       </w:pPr>
@@ -19875,7 +20111,7 @@
           <w:color w:val="000000"/>
           <w:sz w:val="21"/>
         </w:rPr>
-        <w:t>表 2 已填入 SlotSPE 原论文 18 个方法的全部十队列报告值，并加入本文 DCT v3.13。原论文表 1 的 180 个癌种均值与附录表 4 全部交叉核对，18 个 Overall 保留原文；配套 JSON 保存 180 个标准差、来源 PDF SHA256 和 DCT 的真实 50 个折值。该表为公开报告值参考比较。SlotSPE 同条件 native/matched 的四组五折原值、最佳预测与配方信息仍需另行核对。队列人数、事件/删失比例和设备信息仅在真实清单可核验时补入。</w:t>
+        <w:t>表 2 已按作者要求改为 OT 与 UNI2-h 方法的公开结果参照，包含 9 个参照方法及 DCT，保留十癌种列。49 个可按队列名称对齐的公开均值已直接汇总；未报告的队列不补值，LUSC 不排名，不混排不同队列集合的 Overall。公开原值、离散度与来源 SHA256 记录在 paper/V313_OT_UNI2H_COMPARISON_INPUT.json；DCT 的真实 50 个折值不变。旧的 SlotSPE 报告值表仅作为历史文件保留，不再作为正文比较。队列人数、事件/删失比例和设备信息仅在真实清单可核验时补入。</w:t>
       </w:r>
     </w:p>
     <w:p>
@@ -20869,7 +21105,7 @@
                     <pic:cNvPicPr/>
                   </pic:nvPicPr>
                   <pic:blipFill>
-                    <a:blip r:embed="rId29"/>
+                    <a:blip r:embed="rId37"/>
                     <a:stretch>
                       <a:fillRect/>
                     </a:stretch>
@@ -20926,7 +21162,7 @@
                     <pic:cNvPicPr/>
                   </pic:nvPicPr>
                   <pic:blipFill>
-                    <a:blip r:embed="rId30"/>
+                    <a:blip r:embed="rId38"/>
                     <a:stretch>
                       <a:fillRect/>
                     </a:stretch>

</xml_diff>

<commit_message>
paper: expand v313 comparison baselines and verify method years
</commit_message>
<xml_diff>
--- a/paper/DCT_v313_初稿.docx
+++ b/paper/DCT_v313_初稿.docx
@@ -8722,7 +8722,7 @@
           <w:color w:val="000000"/>
           <w:sz w:val="23"/>
         </w:rPr>
-        <w:t>4.3 OT 与 UNI2-h 方法的公开结果参照</w:t>
+        <w:t>4.3 外部方法的公开结果参照</w:t>
       </w:r>
     </w:p>
     <w:p>
@@ -8736,7 +8736,7 @@
           <w:color w:val="000000"/>
           <w:sz w:val="21"/>
         </w:rPr>
-        <w:t>表 2 按研究问题选择 OT 生存预测方法，以及使用 UNI2-h 病理特征的生存预测方法 [9–11]。MOTCat 和 TTA 的数值来自 TTA 表 1；其中 MOTCat 是 TTA 作者使用 UNI、以 DSS 为终点的复现。OTSurv 来自原论文表 1，使用 UNI 和单病理输入。STEPH 与五种 MIL 参照来自其官方补充表 S2，使用 UNI2-h 和单病理输入。本文 DCT 行沿用表 1 的真实 50 个折值，均值不变。</w:t>
+        <w:t>表 2 扩展为 21 个参照方法与 DCT v3.13。MLP、SNN、SNNTrans、ABMIL、TransMIL、CLAM-SB、CLAM-MB、Porpoise、MCAT、MOTCat、CMTA、SurvPath、PIBD、MMP 和 LD-CVAE 的十队列数值来自 SlotSPE 作者表 1 的统一重评估，离散度与附录表 4 核对 [3]；SlotSPE 自身的组学、病理、多模态三行全部排除。额外保留 TTA、OTSurv，以及 STEPH 官方补充表 S2 中的 ILRA、R2T-MIL、Patch-GCN 和 STEPH [9–11]。相同方法不从不同来源逐格选择更高值；本表 MOTCat、ABMIL 与 TransMIL 固定采用十队列重评估来源。</w:t>
       </w:r>
     </w:p>
     <w:p>
@@ -8748,8 +8748,8 @@
       <w:r>
         <w:drawing>
           <wp:inline xmlns:a="http://schemas.openxmlformats.org/drawingml/2006/main" xmlns:pic="http://schemas.openxmlformats.org/drawingml/2006/picture">
-            <wp:extent cx="5940000" cy="2308316"/>
-            <wp:docPr id="2" name="Picture 2" descr="DCT v3.13 与 OT 和 UNI2-h 生存预测方法的公开结果参照"/>
+            <wp:extent cx="5940000" cy="3929694"/>
+            <wp:docPr id="2" name="Picture 2" descr="带方法年份的扩展十癌种公开结果参照"/>
             <wp:cNvGraphicFramePr>
               <a:graphicFrameLocks noChangeAspect="1"/>
             </wp:cNvGraphicFramePr>
@@ -8769,7 +8769,7 @@
                   <pic:spPr>
                     <a:xfrm>
                       <a:off x="0" y="0"/>
-                      <a:ext cx="5940000" cy="2308316"/>
+                      <a:ext cx="5940000" cy="3929694"/>
                     </a:xfrm>
                     <a:prstGeom prst="rect"/>
                   </pic:spPr>
@@ -8793,7 +8793,7 @@
           <w:color w:val="000000"/>
           <w:sz w:val="18"/>
         </w:rPr>
-        <w:t>表 2 十队列公开报告值参照。红色加粗为该列已有报告值中的最高值，下划线为第二个不同的显示值，DCT 行为淡黄色。U1 表示 UNI，U2 表示 UNI2-h；g. 与 h. 分别表示组学和病理。NR 表示论文未单独报告对应队列，不表示服务器汇总未完成。LUSC 没有可用的独立外部队列数值，故不排名。各论文的队列集合不同，不混排 Overall。</w:t>
+        <w:t>表 2 十队列公开报告值参照。每个方法名后标注年份。红色加粗为该列可用报告值中的最高值，下划线为第二个不同的显示值，DCT 行为淡黄色。U1 为 UNI，U2 为 UNI2-h，短横为无需病理编码器；g. 与 h. 分别表示组学和病理。MLP 的 1998 年为原文引用的教材年份，SNNTrans 的 2021 年为组件引用年份，二者以单星标出；DCT 的 2026 年为当前研究年份，以双星标出，不表示已发表。TTA 使用首次预印本年份 2025，分数来自 2026 年 v2。</w:t>
       </w:r>
     </w:p>
     <w:p>
@@ -8807,7 +8807,7 @@
           <w:color w:val="000000"/>
           <w:sz w:val="21"/>
         </w:rPr>
-        <w:t>当前已汇总 49 个可按癌种名称对齐的公开均值。STEPH 的 KIPAN、LUNG、STES 为合并队列，不能分别替换 KIRC、LUAD/LUSC、STAD；TTA 与 OTSurv 的 CRC 在患者定义核对前不映射为 COADREAD。所有原始队列均值与来源离散度保留在配套数值文件中。</w:t>
+        <w:t>当前直接汇总了 183 个可按癌种名称对齐的公开均值，包括原表 15 个非 SlotSPE 基线的全部 150 个十队列均值。十个癌种现在均有外部参照，LUSC 列也纳入排名。原论文未单独报告的额外方法队列保留 NR。STEPH 的 KIPAN、LUNG、STES 不分别替代 KIRC、LUAD/LUSC、STAD，TTA 和 OTSurv 的 CRC 在患者定义核对前不映射为 COADREAD。Overall 仅对报告同样十个癌种的 15 个基线与 DCT 排名；五、六或十三队列来源的总体值不混入这一列。</w:t>
       </w:r>
     </w:p>
     <w:p>
@@ -8821,7 +8821,7 @@
           <w:color w:val="000000"/>
           <w:sz w:val="21"/>
         </w:rPr>
-        <w:t>该表显示当前报告值在部分队列具有竞争力，但输入模态、患者纳入、划分与 checkpoint 选择仍不同。DCT 目前采用 best-validation / legacy_val 开发汇总，列内名次不能解释为相同独立测试条件下的优劣。尤其 UNI2-h 病理单模态参照与 DCT 的病理、组学双模态输入不同；相同编码器本身并不建立公平比较。</w:t>
+        <w:t>本文 DCT 行沿用表 1 的真实 50 个折值。不同论文的模态、患者纳入、划分与 checkpoint 选择仍不同；UNI 病理特征与本研究 UNI2-h 特征的差异也保留在表内。DCT 当前为 best-validation / legacy_val 开发汇总，列内名次用于描述公开值的相对位置，不能解释为相同独立测试条件下的 SOTA。</w:t>
       </w:r>
     </w:p>
     <w:p>
@@ -8835,7 +8835,7 @@
           <w:color w:val="000000"/>
           <w:sz w:val="21"/>
         </w:rPr>
-        <w:t>ProtoPathway 同样使用 UNI2-h，但以 OS 为终点 [12]，故作为结构相近的方法讨论并单独保存其公开值，不纳入本表的 DSS 排名。后续同条件参照优先覆盖 MOTCat、TTA、OTSurv 和 STEPH；模型收益与运输机制仍须结合本研究消融和对照判断。</w:t>
+        <w:t>ProtoPathway 同样使用 UNI2-h，但以 OS 为终点 [12]，作为结构相近的方法讨论并单独保存公开值，不进入 DSS 排名。后续同条件参照优先覆盖 MOTCat、TTA、OTSurv 和 STEPH；模块收益仍结合本研究消融和机制对照判断。</w:t>
       </w:r>
     </w:p>
     <w:p>
@@ -20111,7 +20111,7 @@
           <w:color w:val="000000"/>
           <w:sz w:val="21"/>
         </w:rPr>
-        <w:t>表 2 已按作者要求改为 OT 与 UNI2-h 方法的公开结果参照，包含 9 个参照方法及 DCT，保留十癌种列。49 个可按队列名称对齐的公开均值已直接汇总；未报告的队列不补值，LUSC 不排名，不混排不同队列集合的 Overall。公开原值、离散度与来源 SHA256 记录在 paper/V313_OT_UNI2H_COMPARISON_INPUT.json；DCT 的真实 50 个折值不变。旧的 SlotSPE 报告值表仅作为历史文件保留，不再作为正文比较。队列人数、事件/删失比例和设备信息仅在真实清单可核验时补入。</w:t>
+        <w:t>表 2 已扩展为 21 个参照方法与 DCT，所有方法标注年份，SlotSPE 自身三行全部排除。183 个对齐的公开队列均值已汇总，十癌种均有外部参照；额外方法未报告的单独队列保留 NR。Overall 只比较完整相同十队列行，保留 15 个基线的原文值和 DCT 的未四舍五入宏均值。数据、离散度、年份来源与 SHA256 记录在 paper/V313_OT_UNI2H_COMPARISON_INPUT.json；DCT 的真实 50 个折值不变。旧的全 SlotSPE 表作为历史来源保留，不作为当前正文比较。队列人数、事件/删失比例和设备信息仅在真实清单可核验时补入。</w:t>
       </w:r>
     </w:p>
     <w:p>

</xml_diff>